<commit_message>
Fix font and size word
</commit_message>
<xml_diff>
--- a/BTPT.docx
+++ b/BTPT.docx
@@ -9,8 +9,18 @@
         <w:keepLines w:val="0"/>
         <w:widowControl/>
         <w:suppressLineNumbers w:val="0"/>
+        <w:rPr>
+          <w:rFonts w:hint="default" w:ascii="Times New Roman" w:hAnsi="Times New Roman" w:cs="Times New Roman"/>
+          <w:sz w:val="20"/>
+          <w:szCs w:val="20"/>
+        </w:rPr>
       </w:pPr>
       <w:r>
+        <w:rPr>
+          <w:rFonts w:hint="default" w:ascii="Times New Roman" w:hAnsi="Times New Roman" w:cs="Times New Roman"/>
+          <w:sz w:val="20"/>
+          <w:szCs w:val="20"/>
+        </w:rPr>
         <w:t>PHÂN TÍCH ƯU TIÊN HÓA PRODUCT BACKLOG BẰNG MoSCoW</w:t>
       </w:r>
     </w:p>
@@ -21,8 +31,18 @@
         <w:keepLines w:val="0"/>
         <w:widowControl/>
         <w:suppressLineNumbers w:val="0"/>
+        <w:rPr>
+          <w:rFonts w:hint="default" w:ascii="Times New Roman" w:hAnsi="Times New Roman" w:cs="Times New Roman"/>
+          <w:sz w:val="20"/>
+          <w:szCs w:val="20"/>
+        </w:rPr>
       </w:pPr>
       <w:r>
+        <w:rPr>
+          <w:rFonts w:hint="default" w:ascii="Times New Roman" w:hAnsi="Times New Roman" w:cs="Times New Roman"/>
+          <w:sz w:val="20"/>
+          <w:szCs w:val="20"/>
+        </w:rPr>
         <w:t>PHẦN 1 – ĐỀ XUẤT HAI CÁCH GÁN NHÃN</w:t>
       </w:r>
     </w:p>
@@ -33,10 +53,18 @@
         <w:keepLines w:val="0"/>
         <w:widowControl/>
         <w:suppressLineNumbers w:val="0"/>
+        <w:rPr>
+          <w:rFonts w:hint="default" w:ascii="Times New Roman" w:hAnsi="Times New Roman" w:cs="Times New Roman"/>
+          <w:sz w:val="20"/>
+          <w:szCs w:val="20"/>
+        </w:rPr>
       </w:pPr>
       <w:r>
         <w:rPr>
           <w:rStyle w:val="7"/>
+          <w:rFonts w:hint="default" w:ascii="Times New Roman" w:hAnsi="Times New Roman" w:cs="Times New Roman"/>
+          <w:sz w:val="20"/>
+          <w:szCs w:val="20"/>
         </w:rPr>
         <w:t>Cách 1: Gán nhãn theo mức độ cần thiết của bản phát hành</w:t>
       </w:r>
@@ -48,8 +76,18 @@
         <w:keepLines w:val="0"/>
         <w:widowControl/>
         <w:suppressLineNumbers w:val="0"/>
+        <w:rPr>
+          <w:rFonts w:hint="default" w:ascii="Times New Roman" w:hAnsi="Times New Roman" w:cs="Times New Roman"/>
+          <w:sz w:val="20"/>
+          <w:szCs w:val="20"/>
+        </w:rPr>
       </w:pPr>
       <w:r>
+        <w:rPr>
+          <w:rFonts w:hint="default" w:ascii="Times New Roman" w:hAnsi="Times New Roman" w:cs="Times New Roman"/>
+          <w:sz w:val="20"/>
+          <w:szCs w:val="20"/>
+        </w:rPr>
         <w:t>Đánh giá từng hạng mục dựa trên việc bản phát hành có thể hoạt động đúng yêu cầu hay không nếu thiếu hạng mục đó. Những hạng mục bắt buộc để sửa lỗi nghiêm trọng hoặc đáp ứng yêu cầu chính được xếp Must; các hạng mục có thể trì hoãn được xếp Should hoặc Could.</w:t>
       </w:r>
     </w:p>
@@ -60,10 +98,18 @@
         <w:keepLines w:val="0"/>
         <w:widowControl/>
         <w:suppressLineNumbers w:val="0"/>
+        <w:rPr>
+          <w:rFonts w:hint="default" w:ascii="Times New Roman" w:hAnsi="Times New Roman" w:cs="Times New Roman"/>
+          <w:sz w:val="20"/>
+          <w:szCs w:val="20"/>
+        </w:rPr>
       </w:pPr>
       <w:r>
         <w:rPr>
           <w:rStyle w:val="7"/>
+          <w:rFonts w:hint="default" w:ascii="Times New Roman" w:hAnsi="Times New Roman" w:cs="Times New Roman"/>
+          <w:sz w:val="20"/>
+          <w:szCs w:val="20"/>
         </w:rPr>
         <w:t>Cách 2: Gán nhãn theo mức độ ưu tiên của các bên liên quan</w:t>
       </w:r>
@@ -75,8 +121,18 @@
         <w:keepLines w:val="0"/>
         <w:widowControl/>
         <w:suppressLineNumbers w:val="0"/>
+        <w:rPr>
+          <w:rFonts w:hint="default" w:ascii="Times New Roman" w:hAnsi="Times New Roman" w:cs="Times New Roman"/>
+          <w:sz w:val="20"/>
+          <w:szCs w:val="20"/>
+        </w:rPr>
       </w:pPr>
       <w:r>
+        <w:rPr>
+          <w:rFonts w:hint="default" w:ascii="Times New Roman" w:hAnsi="Times New Roman" w:cs="Times New Roman"/>
+          <w:sz w:val="20"/>
+          <w:szCs w:val="20"/>
+        </w:rPr>
         <w:t>Xếp hạng dựa trên mong muốn và mức độ ưu tiên của các bên như Marketing, Chăm sóc khách hàng và Product Owner. Hạng mục được nhiều bên quan tâm hoặc phục vụ mục tiêu kinh doanh trước mắt sẽ được ưu tiên cao hơn.</w:t>
       </w:r>
     </w:p>
@@ -87,13 +143,24 @@
         <w:keepLines w:val="0"/>
         <w:widowControl/>
         <w:suppressLineNumbers w:val="0"/>
+        <w:rPr>
+          <w:rFonts w:hint="default" w:ascii="Times New Roman" w:hAnsi="Times New Roman" w:cs="Times New Roman"/>
+          <w:sz w:val="20"/>
+          <w:szCs w:val="20"/>
+        </w:rPr>
       </w:pPr>
       <w:r>
+        <w:rPr>
+          <w:rFonts w:hint="default" w:ascii="Times New Roman" w:hAnsi="Times New Roman" w:cs="Times New Roman"/>
+          <w:sz w:val="20"/>
+          <w:szCs w:val="20"/>
+        </w:rPr>
         <w:t>PHẦN 2 – SO SÁNH HAI CÁCH GÁN NHÃN</w:t>
       </w:r>
     </w:p>
     <w:tbl>
       <w:tblPr>
+        <w:tblStyle w:val="6"/>
         <w:tblW w:w="0" w:type="auto"/>
         <w:tblInd w:w="0" w:type="dxa"/>
         <w:tblBorders>
@@ -104,7 +171,7 @@
           <w:insideH w:val="single" w:color="auto" w:sz="4" w:space="0"/>
           <w:insideV w:val="single" w:color="auto" w:sz="4" w:space="0"/>
         </w:tblBorders>
-        <w:shd w:val="clear"/>
+        <w:shd w:val="clear" w:color="auto" w:fill="auto"/>
         <w:tblLayout w:type="autofit"/>
         <w:tblCellMar>
           <w:top w:w="14" w:type="dxa"/>
@@ -114,9 +181,9 @@
         </w:tblCellMar>
       </w:tblPr>
       <w:tblGrid>
-        <w:gridCol w:w="1734"/>
-        <w:gridCol w:w="3548"/>
-        <w:gridCol w:w="3053"/>
+        <w:gridCol w:w="1739"/>
+        <w:gridCol w:w="3564"/>
+        <w:gridCol w:w="3032"/>
       </w:tblGrid>
       <w:tr>
         <w:tblPrEx>
@@ -128,7 +195,7 @@
             <w:insideH w:val="single" w:color="auto" w:sz="4" w:space="0"/>
             <w:insideV w:val="single" w:color="auto" w:sz="4" w:space="0"/>
           </w:tblBorders>
-          <w:shd w:val="clear"/>
+          <w:shd w:val="clear" w:color="auto" w:fill="auto"/>
           <w:tblCellMar>
             <w:top w:w="14" w:type="dxa"/>
             <w:left w:w="15" w:type="dxa"/>
@@ -139,7 +206,7 @@
         <w:tc>
           <w:tcPr>
             <w:tcW w:w="0" w:type="auto"/>
-            <w:shd w:val="clear"/>
+            <w:shd w:val="clear" w:color="auto" w:fill="auto"/>
             <w:vAlign w:val="center"/>
           </w:tcPr>
           <w:p>
@@ -150,18 +217,21 @@
               <w:suppressLineNumbers w:val="0"/>
               <w:jc w:val="center"/>
               <w:rPr>
+                <w:rFonts w:hint="default" w:ascii="Times New Roman" w:hAnsi="Times New Roman" w:cs="Times New Roman"/>
                 <w:b/>
                 <w:bCs/>
-              </w:rPr>
-            </w:pPr>
-            <w:r>
-              <w:rPr>
-                <w:rFonts w:ascii="SimSun" w:hAnsi="SimSun" w:eastAsia="SimSun" w:cs="SimSun"/>
+                <w:sz w:val="20"/>
+                <w:szCs w:val="20"/>
+              </w:rPr>
+            </w:pPr>
+            <w:r>
+              <w:rPr>
+                <w:rFonts w:hint="default" w:ascii="Times New Roman" w:hAnsi="Times New Roman" w:eastAsia="SimSun" w:cs="Times New Roman"/>
                 <w:b/>
                 <w:bCs/>
                 <w:kern w:val="0"/>
-                <w:sz w:val="24"/>
-                <w:szCs w:val="24"/>
+                <w:sz w:val="20"/>
+                <w:szCs w:val="20"/>
                 <w:lang w:val="en-US" w:eastAsia="zh-CN" w:bidi="ar"/>
               </w:rPr>
               <w:t>Tiêu chí</w:t>
@@ -171,7 +241,7 @@
         <w:tc>
           <w:tcPr>
             <w:tcW w:w="0" w:type="auto"/>
-            <w:shd w:val="clear"/>
+            <w:shd w:val="clear" w:color="auto" w:fill="auto"/>
             <w:vAlign w:val="center"/>
           </w:tcPr>
           <w:p>
@@ -182,18 +252,21 @@
               <w:suppressLineNumbers w:val="0"/>
               <w:jc w:val="center"/>
               <w:rPr>
+                <w:rFonts w:hint="default" w:ascii="Times New Roman" w:hAnsi="Times New Roman" w:cs="Times New Roman"/>
                 <w:b/>
                 <w:bCs/>
-              </w:rPr>
-            </w:pPr>
-            <w:r>
-              <w:rPr>
-                <w:rFonts w:ascii="SimSun" w:hAnsi="SimSun" w:eastAsia="SimSun" w:cs="SimSun"/>
+                <w:sz w:val="20"/>
+                <w:szCs w:val="20"/>
+              </w:rPr>
+            </w:pPr>
+            <w:r>
+              <w:rPr>
+                <w:rFonts w:hint="default" w:ascii="Times New Roman" w:hAnsi="Times New Roman" w:eastAsia="SimSun" w:cs="Times New Roman"/>
                 <w:b/>
                 <w:bCs/>
                 <w:kern w:val="0"/>
-                <w:sz w:val="24"/>
-                <w:szCs w:val="24"/>
+                <w:sz w:val="20"/>
+                <w:szCs w:val="20"/>
                 <w:lang w:val="en-US" w:eastAsia="zh-CN" w:bidi="ar"/>
               </w:rPr>
               <w:t>Cách 1: Theo mức độ cần thiết</w:t>
@@ -203,7 +276,7 @@
         <w:tc>
           <w:tcPr>
             <w:tcW w:w="0" w:type="auto"/>
-            <w:shd w:val="clear"/>
+            <w:shd w:val="clear" w:color="auto" w:fill="auto"/>
             <w:vAlign w:val="center"/>
           </w:tcPr>
           <w:p>
@@ -214,18 +287,21 @@
               <w:suppressLineNumbers w:val="0"/>
               <w:jc w:val="center"/>
               <w:rPr>
+                <w:rFonts w:hint="default" w:ascii="Times New Roman" w:hAnsi="Times New Roman" w:cs="Times New Roman"/>
                 <w:b/>
                 <w:bCs/>
-              </w:rPr>
-            </w:pPr>
-            <w:r>
-              <w:rPr>
-                <w:rFonts w:ascii="SimSun" w:hAnsi="SimSun" w:eastAsia="SimSun" w:cs="SimSun"/>
+                <w:sz w:val="20"/>
+                <w:szCs w:val="20"/>
+              </w:rPr>
+            </w:pPr>
+            <w:r>
+              <w:rPr>
+                <w:rFonts w:hint="default" w:ascii="Times New Roman" w:hAnsi="Times New Roman" w:eastAsia="SimSun" w:cs="Times New Roman"/>
                 <w:b/>
                 <w:bCs/>
                 <w:kern w:val="0"/>
-                <w:sz w:val="24"/>
-                <w:szCs w:val="24"/>
+                <w:sz w:val="20"/>
+                <w:szCs w:val="20"/>
                 <w:lang w:val="en-US" w:eastAsia="zh-CN" w:bidi="ar"/>
               </w:rPr>
               <w:t>Cách 2: Theo ưu tiên các bên liên quan</w:t>
@@ -243,7 +319,7 @@
             <w:insideH w:val="single" w:color="auto" w:sz="4" w:space="0"/>
             <w:insideV w:val="single" w:color="auto" w:sz="4" w:space="0"/>
           </w:tblBorders>
-          <w:shd w:val="clear"/>
+          <w:shd w:val="clear" w:color="auto" w:fill="auto"/>
           <w:tblCellMar>
             <w:top w:w="14" w:type="dxa"/>
             <w:left w:w="15" w:type="dxa"/>
@@ -254,23 +330,28 @@
         <w:tc>
           <w:tcPr>
             <w:tcW w:w="0" w:type="auto"/>
-            <w:shd w:val="clear"/>
-            <w:vAlign w:val="center"/>
-          </w:tcPr>
-          <w:p>
-            <w:pPr>
-              <w:keepNext w:val="0"/>
-              <w:keepLines w:val="0"/>
-              <w:widowControl/>
-              <w:suppressLineNumbers w:val="0"/>
-              <w:jc w:val="left"/>
-            </w:pPr>
-            <w:r>
-              <w:rPr>
-                <w:rFonts w:ascii="SimSun" w:hAnsi="SimSun" w:eastAsia="SimSun" w:cs="SimSun"/>
-                <w:kern w:val="0"/>
-                <w:sz w:val="24"/>
-                <w:szCs w:val="24"/>
+            <w:shd w:val="clear" w:color="auto" w:fill="auto"/>
+            <w:vAlign w:val="center"/>
+          </w:tcPr>
+          <w:p>
+            <w:pPr>
+              <w:keepNext w:val="0"/>
+              <w:keepLines w:val="0"/>
+              <w:widowControl/>
+              <w:suppressLineNumbers w:val="0"/>
+              <w:jc w:val="left"/>
+              <w:rPr>
+                <w:rFonts w:hint="default" w:ascii="Times New Roman" w:hAnsi="Times New Roman" w:cs="Times New Roman"/>
+                <w:sz w:val="20"/>
+                <w:szCs w:val="20"/>
+              </w:rPr>
+            </w:pPr>
+            <w:r>
+              <w:rPr>
+                <w:rFonts w:hint="default" w:ascii="Times New Roman" w:hAnsi="Times New Roman" w:eastAsia="SimSun" w:cs="Times New Roman"/>
+                <w:kern w:val="0"/>
+                <w:sz w:val="20"/>
+                <w:szCs w:val="20"/>
                 <w:lang w:val="en-US" w:eastAsia="zh-CN" w:bidi="ar"/>
               </w:rPr>
               <w:t>Khách quan khi nhiều bộ phận cùng đề xuất</w:t>
@@ -280,23 +361,28 @@
         <w:tc>
           <w:tcPr>
             <w:tcW w:w="0" w:type="auto"/>
-            <w:shd w:val="clear"/>
-            <w:vAlign w:val="center"/>
-          </w:tcPr>
-          <w:p>
-            <w:pPr>
-              <w:keepNext w:val="0"/>
-              <w:keepLines w:val="0"/>
-              <w:widowControl/>
-              <w:suppressLineNumbers w:val="0"/>
-              <w:jc w:val="left"/>
-            </w:pPr>
-            <w:r>
-              <w:rPr>
-                <w:rFonts w:ascii="SimSun" w:hAnsi="SimSun" w:eastAsia="SimSun" w:cs="SimSun"/>
-                <w:kern w:val="0"/>
-                <w:sz w:val="24"/>
-                <w:szCs w:val="24"/>
+            <w:shd w:val="clear" w:color="auto" w:fill="auto"/>
+            <w:vAlign w:val="center"/>
+          </w:tcPr>
+          <w:p>
+            <w:pPr>
+              <w:keepNext w:val="0"/>
+              <w:keepLines w:val="0"/>
+              <w:widowControl/>
+              <w:suppressLineNumbers w:val="0"/>
+              <w:jc w:val="left"/>
+              <w:rPr>
+                <w:rFonts w:hint="default" w:ascii="Times New Roman" w:hAnsi="Times New Roman" w:cs="Times New Roman"/>
+                <w:sz w:val="20"/>
+                <w:szCs w:val="20"/>
+              </w:rPr>
+            </w:pPr>
+            <w:r>
+              <w:rPr>
+                <w:rFonts w:hint="default" w:ascii="Times New Roman" w:hAnsi="Times New Roman" w:eastAsia="SimSun" w:cs="Times New Roman"/>
+                <w:kern w:val="0"/>
+                <w:sz w:val="20"/>
+                <w:szCs w:val="20"/>
                 <w:lang w:val="en-US" w:eastAsia="zh-CN" w:bidi="ar"/>
               </w:rPr>
               <w:t>(+) Dựa trên yêu cầu của bản phát hành và hậu quả nếu thiếu hạng mục, giúp hạn chế ý kiến chủ quan.</w:t>
@@ -306,23 +392,28 @@
         <w:tc>
           <w:tcPr>
             <w:tcW w:w="0" w:type="auto"/>
-            <w:shd w:val="clear"/>
-            <w:vAlign w:val="center"/>
-          </w:tcPr>
-          <w:p>
-            <w:pPr>
-              <w:keepNext w:val="0"/>
-              <w:keepLines w:val="0"/>
-              <w:widowControl/>
-              <w:suppressLineNumbers w:val="0"/>
-              <w:jc w:val="left"/>
-            </w:pPr>
-            <w:r>
-              <w:rPr>
-                <w:rFonts w:ascii="SimSun" w:hAnsi="SimSun" w:eastAsia="SimSun" w:cs="SimSun"/>
-                <w:kern w:val="0"/>
-                <w:sz w:val="24"/>
-                <w:szCs w:val="24"/>
+            <w:shd w:val="clear" w:color="auto" w:fill="auto"/>
+            <w:vAlign w:val="center"/>
+          </w:tcPr>
+          <w:p>
+            <w:pPr>
+              <w:keepNext w:val="0"/>
+              <w:keepLines w:val="0"/>
+              <w:widowControl/>
+              <w:suppressLineNumbers w:val="0"/>
+              <w:jc w:val="left"/>
+              <w:rPr>
+                <w:rFonts w:hint="default" w:ascii="Times New Roman" w:hAnsi="Times New Roman" w:cs="Times New Roman"/>
+                <w:sz w:val="20"/>
+                <w:szCs w:val="20"/>
+              </w:rPr>
+            </w:pPr>
+            <w:r>
+              <w:rPr>
+                <w:rFonts w:hint="default" w:ascii="Times New Roman" w:hAnsi="Times New Roman" w:eastAsia="SimSun" w:cs="Times New Roman"/>
+                <w:kern w:val="0"/>
+                <w:sz w:val="20"/>
+                <w:szCs w:val="20"/>
                 <w:lang w:val="en-US" w:eastAsia="zh-CN" w:bidi="ar"/>
               </w:rPr>
               <w:t>(–) Mỗi bộ phận có mục tiêu riêng nên dễ xảy ra tranh luận về mức độ ưu tiên.</w:t>
@@ -340,7 +431,7 @@
             <w:insideH w:val="single" w:color="auto" w:sz="4" w:space="0"/>
             <w:insideV w:val="single" w:color="auto" w:sz="4" w:space="0"/>
           </w:tblBorders>
-          <w:shd w:val="clear"/>
+          <w:shd w:val="clear" w:color="auto" w:fill="auto"/>
           <w:tblCellMar>
             <w:top w:w="14" w:type="dxa"/>
             <w:left w:w="15" w:type="dxa"/>
@@ -351,23 +442,28 @@
         <w:tc>
           <w:tcPr>
             <w:tcW w:w="0" w:type="auto"/>
-            <w:shd w:val="clear"/>
-            <w:vAlign w:val="center"/>
-          </w:tcPr>
-          <w:p>
-            <w:pPr>
-              <w:keepNext w:val="0"/>
-              <w:keepLines w:val="0"/>
-              <w:widowControl/>
-              <w:suppressLineNumbers w:val="0"/>
-              <w:jc w:val="left"/>
-            </w:pPr>
-            <w:r>
-              <w:rPr>
-                <w:rFonts w:ascii="SimSun" w:hAnsi="SimSun" w:eastAsia="SimSun" w:cs="SimSun"/>
-                <w:kern w:val="0"/>
-                <w:sz w:val="24"/>
-                <w:szCs w:val="24"/>
+            <w:shd w:val="clear" w:color="auto" w:fill="auto"/>
+            <w:vAlign w:val="center"/>
+          </w:tcPr>
+          <w:p>
+            <w:pPr>
+              <w:keepNext w:val="0"/>
+              <w:keepLines w:val="0"/>
+              <w:widowControl/>
+              <w:suppressLineNumbers w:val="0"/>
+              <w:jc w:val="left"/>
+              <w:rPr>
+                <w:rFonts w:hint="default" w:ascii="Times New Roman" w:hAnsi="Times New Roman" w:cs="Times New Roman"/>
+                <w:sz w:val="20"/>
+                <w:szCs w:val="20"/>
+              </w:rPr>
+            </w:pPr>
+            <w:r>
+              <w:rPr>
+                <w:rFonts w:hint="default" w:ascii="Times New Roman" w:hAnsi="Times New Roman" w:eastAsia="SimSun" w:cs="Times New Roman"/>
+                <w:kern w:val="0"/>
+                <w:sz w:val="20"/>
+                <w:szCs w:val="20"/>
                 <w:lang w:val="en-US" w:eastAsia="zh-CN" w:bidi="ar"/>
               </w:rPr>
               <w:t>Bảo vệ hạng mục bắt buộc như #1</w:t>
@@ -377,23 +473,28 @@
         <w:tc>
           <w:tcPr>
             <w:tcW w:w="0" w:type="auto"/>
-            <w:shd w:val="clear"/>
-            <w:vAlign w:val="center"/>
-          </w:tcPr>
-          <w:p>
-            <w:pPr>
-              <w:keepNext w:val="0"/>
-              <w:keepLines w:val="0"/>
-              <w:widowControl/>
-              <w:suppressLineNumbers w:val="0"/>
-              <w:jc w:val="left"/>
-            </w:pPr>
-            <w:r>
-              <w:rPr>
-                <w:rFonts w:ascii="SimSun" w:hAnsi="SimSun" w:eastAsia="SimSun" w:cs="SimSun"/>
-                <w:kern w:val="0"/>
-                <w:sz w:val="24"/>
-                <w:szCs w:val="24"/>
+            <w:shd w:val="clear" w:color="auto" w:fill="auto"/>
+            <w:vAlign w:val="center"/>
+          </w:tcPr>
+          <w:p>
+            <w:pPr>
+              <w:keepNext w:val="0"/>
+              <w:keepLines w:val="0"/>
+              <w:widowControl/>
+              <w:suppressLineNumbers w:val="0"/>
+              <w:jc w:val="left"/>
+              <w:rPr>
+                <w:rFonts w:hint="default" w:ascii="Times New Roman" w:hAnsi="Times New Roman" w:cs="Times New Roman"/>
+                <w:sz w:val="20"/>
+                <w:szCs w:val="20"/>
+              </w:rPr>
+            </w:pPr>
+            <w:r>
+              <w:rPr>
+                <w:rFonts w:hint="default" w:ascii="Times New Roman" w:hAnsi="Times New Roman" w:eastAsia="SimSun" w:cs="Times New Roman"/>
+                <w:kern w:val="0"/>
+                <w:sz w:val="20"/>
+                <w:szCs w:val="20"/>
                 <w:lang w:val="en-US" w:eastAsia="zh-CN" w:bidi="ar"/>
               </w:rPr>
               <w:t>(+) Lỗi thu sai tiền khách phải được sửa trước khi phát hành, dù bộ phận nào đề xuất.</w:t>
@@ -403,23 +504,28 @@
         <w:tc>
           <w:tcPr>
             <w:tcW w:w="0" w:type="auto"/>
-            <w:shd w:val="clear"/>
-            <w:vAlign w:val="center"/>
-          </w:tcPr>
-          <w:p>
-            <w:pPr>
-              <w:keepNext w:val="0"/>
-              <w:keepLines w:val="0"/>
-              <w:widowControl/>
-              <w:suppressLineNumbers w:val="0"/>
-              <w:jc w:val="left"/>
-            </w:pPr>
-            <w:r>
-              <w:rPr>
-                <w:rFonts w:ascii="SimSun" w:hAnsi="SimSun" w:eastAsia="SimSun" w:cs="SimSun"/>
-                <w:kern w:val="0"/>
-                <w:sz w:val="24"/>
-                <w:szCs w:val="24"/>
+            <w:shd w:val="clear" w:color="auto" w:fill="auto"/>
+            <w:vAlign w:val="center"/>
+          </w:tcPr>
+          <w:p>
+            <w:pPr>
+              <w:keepNext w:val="0"/>
+              <w:keepLines w:val="0"/>
+              <w:widowControl/>
+              <w:suppressLineNumbers w:val="0"/>
+              <w:jc w:val="left"/>
+              <w:rPr>
+                <w:rFonts w:hint="default" w:ascii="Times New Roman" w:hAnsi="Times New Roman" w:cs="Times New Roman"/>
+                <w:sz w:val="20"/>
+                <w:szCs w:val="20"/>
+              </w:rPr>
+            </w:pPr>
+            <w:r>
+              <w:rPr>
+                <w:rFonts w:hint="default" w:ascii="Times New Roman" w:hAnsi="Times New Roman" w:eastAsia="SimSun" w:cs="Times New Roman"/>
+                <w:kern w:val="0"/>
+                <w:sz w:val="20"/>
+                <w:szCs w:val="20"/>
                 <w:lang w:val="en-US" w:eastAsia="zh-CN" w:bidi="ar"/>
               </w:rPr>
               <w:t>(–) Hạng mục sửa lỗi có thể bị xếp sau các yêu cầu được nhiều bộ phận quan tâm hơn.</w:t>
@@ -435,8 +541,18 @@
         <w:keepLines w:val="0"/>
         <w:widowControl/>
         <w:suppressLineNumbers w:val="0"/>
+        <w:rPr>
+          <w:rFonts w:hint="default" w:ascii="Times New Roman" w:hAnsi="Times New Roman" w:cs="Times New Roman"/>
+          <w:sz w:val="20"/>
+          <w:szCs w:val="20"/>
+        </w:rPr>
       </w:pPr>
       <w:r>
+        <w:rPr>
+          <w:rFonts w:hint="default" w:ascii="Times New Roman" w:hAnsi="Times New Roman" w:cs="Times New Roman"/>
+          <w:sz w:val="20"/>
+          <w:szCs w:val="20"/>
+        </w:rPr>
         <w:t>PHẦN 3 – ÁP DỤNG MoSCoW</w:t>
       </w:r>
     </w:p>
@@ -447,8 +563,18 @@
         <w:keepLines w:val="0"/>
         <w:widowControl/>
         <w:suppressLineNumbers w:val="0"/>
+        <w:rPr>
+          <w:rFonts w:hint="default" w:ascii="Times New Roman" w:hAnsi="Times New Roman" w:cs="Times New Roman"/>
+          <w:sz w:val="20"/>
+          <w:szCs w:val="20"/>
+        </w:rPr>
       </w:pPr>
       <w:r>
+        <w:rPr>
+          <w:rFonts w:hint="default" w:ascii="Times New Roman" w:hAnsi="Times New Roman" w:cs="Times New Roman"/>
+          <w:sz w:val="20"/>
+          <w:szCs w:val="20"/>
+        </w:rPr>
         <w:t>3.1. Chọn cách gán nhãn</w:t>
       </w:r>
     </w:p>
@@ -459,17 +585,35 @@
         <w:keepLines w:val="0"/>
         <w:widowControl/>
         <w:suppressLineNumbers w:val="0"/>
+        <w:rPr>
+          <w:rFonts w:hint="default" w:ascii="Times New Roman" w:hAnsi="Times New Roman" w:cs="Times New Roman"/>
+          <w:sz w:val="20"/>
+          <w:szCs w:val="20"/>
+        </w:rPr>
       </w:pPr>
       <w:r>
+        <w:rPr>
+          <w:rFonts w:hint="default" w:ascii="Times New Roman" w:hAnsi="Times New Roman" w:cs="Times New Roman"/>
+          <w:sz w:val="20"/>
+          <w:szCs w:val="20"/>
+        </w:rPr>
         <w:t xml:space="preserve">Chọn </w:t>
       </w:r>
       <w:r>
         <w:rPr>
           <w:rStyle w:val="7"/>
+          <w:rFonts w:hint="default" w:ascii="Times New Roman" w:hAnsi="Times New Roman" w:cs="Times New Roman"/>
+          <w:sz w:val="20"/>
+          <w:szCs w:val="20"/>
         </w:rPr>
         <w:t>Cách 1: Gán nhãn theo mức độ cần thiết của bản phát hành</w:t>
       </w:r>
       <w:r>
+        <w:rPr>
+          <w:rFonts w:hint="default" w:ascii="Times New Roman" w:hAnsi="Times New Roman" w:cs="Times New Roman"/>
+          <w:sz w:val="20"/>
+          <w:szCs w:val="20"/>
+        </w:rPr>
         <w:t xml:space="preserve"> vì cách này giúp xác định những hạng mục thực sự bắt buộc, hạn chế tranh luận giữa các bộ phận và bảo đảm bản phát hành đáp ứng yêu cầu quan trọng.</w:t>
       </w:r>
     </w:p>
@@ -480,13 +624,24 @@
         <w:keepLines w:val="0"/>
         <w:widowControl/>
         <w:suppressLineNumbers w:val="0"/>
+        <w:rPr>
+          <w:rFonts w:hint="default" w:ascii="Times New Roman" w:hAnsi="Times New Roman" w:cs="Times New Roman"/>
+          <w:sz w:val="20"/>
+          <w:szCs w:val="20"/>
+        </w:rPr>
       </w:pPr>
       <w:r>
+        <w:rPr>
+          <w:rFonts w:hint="default" w:ascii="Times New Roman" w:hAnsi="Times New Roman" w:cs="Times New Roman"/>
+          <w:sz w:val="20"/>
+          <w:szCs w:val="20"/>
+        </w:rPr>
         <w:t>3.2. Gán nhãn cho 6 hạng mục</w:t>
       </w:r>
     </w:p>
     <w:tbl>
       <w:tblPr>
+        <w:tblStyle w:val="6"/>
         <w:tblW w:w="0" w:type="auto"/>
         <w:tblInd w:w="0" w:type="dxa"/>
         <w:tblBorders>
@@ -497,7 +652,7 @@
           <w:insideH w:val="single" w:color="auto" w:sz="4" w:space="0"/>
           <w:insideV w:val="single" w:color="auto" w:sz="4" w:space="0"/>
         </w:tblBorders>
-        <w:shd w:val="clear"/>
+        <w:shd w:val="clear" w:color="auto" w:fill="auto"/>
         <w:tblLayout w:type="autofit"/>
         <w:tblCellMar>
           <w:top w:w="14" w:type="dxa"/>
@@ -507,11 +662,11 @@
         </w:tblCellMar>
       </w:tblPr>
       <w:tblGrid>
-        <w:gridCol w:w="392"/>
-        <w:gridCol w:w="2515"/>
-        <w:gridCol w:w="578"/>
-        <w:gridCol w:w="937"/>
-        <w:gridCol w:w="3913"/>
+        <w:gridCol w:w="408"/>
+        <w:gridCol w:w="2313"/>
+        <w:gridCol w:w="485"/>
+        <w:gridCol w:w="1120"/>
+        <w:gridCol w:w="4009"/>
       </w:tblGrid>
       <w:tr>
         <w:tblPrEx>
@@ -523,7 +678,7 @@
             <w:insideH w:val="single" w:color="auto" w:sz="4" w:space="0"/>
             <w:insideV w:val="single" w:color="auto" w:sz="4" w:space="0"/>
           </w:tblBorders>
-          <w:shd w:val="clear"/>
+          <w:shd w:val="clear" w:color="auto" w:fill="auto"/>
           <w:tblCellMar>
             <w:top w:w="14" w:type="dxa"/>
             <w:left w:w="15" w:type="dxa"/>
@@ -534,7 +689,7 @@
         <w:tc>
           <w:tcPr>
             <w:tcW w:w="0" w:type="auto"/>
-            <w:shd w:val="clear"/>
+            <w:shd w:val="clear" w:color="auto" w:fill="auto"/>
             <w:vAlign w:val="center"/>
           </w:tcPr>
           <w:p>
@@ -545,18 +700,21 @@
               <w:suppressLineNumbers w:val="0"/>
               <w:jc w:val="center"/>
               <w:rPr>
+                <w:rFonts w:hint="default" w:ascii="Times New Roman" w:hAnsi="Times New Roman" w:cs="Times New Roman"/>
                 <w:b/>
                 <w:bCs/>
-              </w:rPr>
-            </w:pPr>
-            <w:r>
-              <w:rPr>
-                <w:rFonts w:ascii="SimSun" w:hAnsi="SimSun" w:eastAsia="SimSun" w:cs="SimSun"/>
+                <w:sz w:val="20"/>
+                <w:szCs w:val="20"/>
+              </w:rPr>
+            </w:pPr>
+            <w:r>
+              <w:rPr>
+                <w:rFonts w:hint="default" w:ascii="Times New Roman" w:hAnsi="Times New Roman" w:eastAsia="SimSun" w:cs="Times New Roman"/>
                 <w:b/>
                 <w:bCs/>
                 <w:kern w:val="0"/>
-                <w:sz w:val="24"/>
-                <w:szCs w:val="24"/>
+                <w:sz w:val="20"/>
+                <w:szCs w:val="20"/>
                 <w:lang w:val="en-US" w:eastAsia="zh-CN" w:bidi="ar"/>
               </w:rPr>
               <w:t>STT</w:t>
@@ -566,7 +724,7 @@
         <w:tc>
           <w:tcPr>
             <w:tcW w:w="0" w:type="auto"/>
-            <w:shd w:val="clear"/>
+            <w:shd w:val="clear" w:color="auto" w:fill="auto"/>
             <w:vAlign w:val="center"/>
           </w:tcPr>
           <w:p>
@@ -577,18 +735,21 @@
               <w:suppressLineNumbers w:val="0"/>
               <w:jc w:val="center"/>
               <w:rPr>
+                <w:rFonts w:hint="default" w:ascii="Times New Roman" w:hAnsi="Times New Roman" w:cs="Times New Roman"/>
                 <w:b/>
                 <w:bCs/>
-              </w:rPr>
-            </w:pPr>
-            <w:r>
-              <w:rPr>
-                <w:rFonts w:ascii="SimSun" w:hAnsi="SimSun" w:eastAsia="SimSun" w:cs="SimSun"/>
+                <w:sz w:val="20"/>
+                <w:szCs w:val="20"/>
+              </w:rPr>
+            </w:pPr>
+            <w:r>
+              <w:rPr>
+                <w:rFonts w:hint="default" w:ascii="Times New Roman" w:hAnsi="Times New Roman" w:eastAsia="SimSun" w:cs="Times New Roman"/>
                 <w:b/>
                 <w:bCs/>
                 <w:kern w:val="0"/>
-                <w:sz w:val="24"/>
-                <w:szCs w:val="24"/>
+                <w:sz w:val="20"/>
+                <w:szCs w:val="20"/>
                 <w:lang w:val="en-US" w:eastAsia="zh-CN" w:bidi="ar"/>
               </w:rPr>
               <w:t>Hạng mục</w:t>
@@ -598,7 +759,7 @@
         <w:tc>
           <w:tcPr>
             <w:tcW w:w="0" w:type="auto"/>
-            <w:shd w:val="clear"/>
+            <w:shd w:val="clear" w:color="auto" w:fill="auto"/>
             <w:vAlign w:val="center"/>
           </w:tcPr>
           <w:p>
@@ -609,18 +770,21 @@
               <w:suppressLineNumbers w:val="0"/>
               <w:jc w:val="center"/>
               <w:rPr>
+                <w:rFonts w:hint="default" w:ascii="Times New Roman" w:hAnsi="Times New Roman" w:cs="Times New Roman"/>
                 <w:b/>
                 <w:bCs/>
-              </w:rPr>
-            </w:pPr>
-            <w:r>
-              <w:rPr>
-                <w:rFonts w:ascii="SimSun" w:hAnsi="SimSun" w:eastAsia="SimSun" w:cs="SimSun"/>
+                <w:sz w:val="20"/>
+                <w:szCs w:val="20"/>
+              </w:rPr>
+            </w:pPr>
+            <w:r>
+              <w:rPr>
+                <w:rFonts w:hint="default" w:ascii="Times New Roman" w:hAnsi="Times New Roman" w:eastAsia="SimSun" w:cs="Times New Roman"/>
                 <w:b/>
                 <w:bCs/>
                 <w:kern w:val="0"/>
-                <w:sz w:val="24"/>
-                <w:szCs w:val="24"/>
+                <w:sz w:val="20"/>
+                <w:szCs w:val="20"/>
                 <w:lang w:val="en-US" w:eastAsia="zh-CN" w:bidi="ar"/>
               </w:rPr>
               <w:t>Điểm</w:t>
@@ -630,7 +794,7 @@
         <w:tc>
           <w:tcPr>
             <w:tcW w:w="0" w:type="auto"/>
-            <w:shd w:val="clear"/>
+            <w:shd w:val="clear" w:color="auto" w:fill="auto"/>
             <w:vAlign w:val="center"/>
           </w:tcPr>
           <w:p>
@@ -641,18 +805,21 @@
               <w:suppressLineNumbers w:val="0"/>
               <w:jc w:val="center"/>
               <w:rPr>
+                <w:rFonts w:hint="default" w:ascii="Times New Roman" w:hAnsi="Times New Roman" w:cs="Times New Roman"/>
                 <w:b/>
                 <w:bCs/>
-              </w:rPr>
-            </w:pPr>
-            <w:r>
-              <w:rPr>
-                <w:rFonts w:ascii="SimSun" w:hAnsi="SimSun" w:eastAsia="SimSun" w:cs="SimSun"/>
+                <w:sz w:val="20"/>
+                <w:szCs w:val="20"/>
+              </w:rPr>
+            </w:pPr>
+            <w:r>
+              <w:rPr>
+                <w:rFonts w:hint="default" w:ascii="Times New Roman" w:hAnsi="Times New Roman" w:eastAsia="SimSun" w:cs="Times New Roman"/>
                 <w:b/>
                 <w:bCs/>
                 <w:kern w:val="0"/>
-                <w:sz w:val="24"/>
-                <w:szCs w:val="24"/>
+                <w:sz w:val="20"/>
+                <w:szCs w:val="20"/>
                 <w:lang w:val="en-US" w:eastAsia="zh-CN" w:bidi="ar"/>
               </w:rPr>
               <w:t>Nhãn MoSCoW</w:t>
@@ -662,7 +829,7 @@
         <w:tc>
           <w:tcPr>
             <w:tcW w:w="0" w:type="auto"/>
-            <w:shd w:val="clear"/>
+            <w:shd w:val="clear" w:color="auto" w:fill="auto"/>
             <w:vAlign w:val="center"/>
           </w:tcPr>
           <w:p>
@@ -673,18 +840,21 @@
               <w:suppressLineNumbers w:val="0"/>
               <w:jc w:val="center"/>
               <w:rPr>
+                <w:rFonts w:hint="default" w:ascii="Times New Roman" w:hAnsi="Times New Roman" w:cs="Times New Roman"/>
                 <w:b/>
                 <w:bCs/>
-              </w:rPr>
-            </w:pPr>
-            <w:r>
-              <w:rPr>
-                <w:rFonts w:ascii="SimSun" w:hAnsi="SimSun" w:eastAsia="SimSun" w:cs="SimSun"/>
+                <w:sz w:val="20"/>
+                <w:szCs w:val="20"/>
+              </w:rPr>
+            </w:pPr>
+            <w:r>
+              <w:rPr>
+                <w:rFonts w:hint="default" w:ascii="Times New Roman" w:hAnsi="Times New Roman" w:eastAsia="SimSun" w:cs="Times New Roman"/>
                 <w:b/>
                 <w:bCs/>
                 <w:kern w:val="0"/>
-                <w:sz w:val="24"/>
-                <w:szCs w:val="24"/>
+                <w:sz w:val="20"/>
+                <w:szCs w:val="20"/>
                 <w:lang w:val="en-US" w:eastAsia="zh-CN" w:bidi="ar"/>
               </w:rPr>
               <w:t>Lý do</w:t>
@@ -702,7 +872,7 @@
             <w:insideH w:val="single" w:color="auto" w:sz="4" w:space="0"/>
             <w:insideV w:val="single" w:color="auto" w:sz="4" w:space="0"/>
           </w:tblBorders>
-          <w:shd w:val="clear"/>
+          <w:shd w:val="clear" w:color="auto" w:fill="auto"/>
           <w:tblCellMar>
             <w:top w:w="14" w:type="dxa"/>
             <w:left w:w="15" w:type="dxa"/>
@@ -713,23 +883,28 @@
         <w:tc>
           <w:tcPr>
             <w:tcW w:w="0" w:type="auto"/>
-            <w:shd w:val="clear"/>
-            <w:vAlign w:val="center"/>
-          </w:tcPr>
-          <w:p>
-            <w:pPr>
-              <w:keepNext w:val="0"/>
-              <w:keepLines w:val="0"/>
-              <w:widowControl/>
-              <w:suppressLineNumbers w:val="0"/>
-              <w:jc w:val="left"/>
-            </w:pPr>
-            <w:r>
-              <w:rPr>
-                <w:rFonts w:ascii="SimSun" w:hAnsi="SimSun" w:eastAsia="SimSun" w:cs="SimSun"/>
-                <w:kern w:val="0"/>
-                <w:sz w:val="24"/>
-                <w:szCs w:val="24"/>
+            <w:shd w:val="clear" w:color="auto" w:fill="auto"/>
+            <w:vAlign w:val="center"/>
+          </w:tcPr>
+          <w:p>
+            <w:pPr>
+              <w:keepNext w:val="0"/>
+              <w:keepLines w:val="0"/>
+              <w:widowControl/>
+              <w:suppressLineNumbers w:val="0"/>
+              <w:jc w:val="left"/>
+              <w:rPr>
+                <w:rFonts w:hint="default" w:ascii="Times New Roman" w:hAnsi="Times New Roman" w:cs="Times New Roman"/>
+                <w:sz w:val="20"/>
+                <w:szCs w:val="20"/>
+              </w:rPr>
+            </w:pPr>
+            <w:r>
+              <w:rPr>
+                <w:rFonts w:hint="default" w:ascii="Times New Roman" w:hAnsi="Times New Roman" w:eastAsia="SimSun" w:cs="Times New Roman"/>
+                <w:kern w:val="0"/>
+                <w:sz w:val="20"/>
+                <w:szCs w:val="20"/>
                 <w:lang w:val="en-US" w:eastAsia="zh-CN" w:bidi="ar"/>
               </w:rPr>
               <w:t>1</w:t>
@@ -739,23 +914,28 @@
         <w:tc>
           <w:tcPr>
             <w:tcW w:w="0" w:type="auto"/>
-            <w:shd w:val="clear"/>
-            <w:vAlign w:val="center"/>
-          </w:tcPr>
-          <w:p>
-            <w:pPr>
-              <w:keepNext w:val="0"/>
-              <w:keepLines w:val="0"/>
-              <w:widowControl/>
-              <w:suppressLineNumbers w:val="0"/>
-              <w:jc w:val="left"/>
-            </w:pPr>
-            <w:r>
-              <w:rPr>
-                <w:rFonts w:ascii="SimSun" w:hAnsi="SimSun" w:eastAsia="SimSun" w:cs="SimSun"/>
-                <w:kern w:val="0"/>
-                <w:sz w:val="24"/>
-                <w:szCs w:val="24"/>
+            <w:shd w:val="clear" w:color="auto" w:fill="auto"/>
+            <w:vAlign w:val="center"/>
+          </w:tcPr>
+          <w:p>
+            <w:pPr>
+              <w:keepNext w:val="0"/>
+              <w:keepLines w:val="0"/>
+              <w:widowControl/>
+              <w:suppressLineNumbers w:val="0"/>
+              <w:jc w:val="left"/>
+              <w:rPr>
+                <w:rFonts w:hint="default" w:ascii="Times New Roman" w:hAnsi="Times New Roman" w:cs="Times New Roman"/>
+                <w:sz w:val="20"/>
+                <w:szCs w:val="20"/>
+              </w:rPr>
+            </w:pPr>
+            <w:r>
+              <w:rPr>
+                <w:rFonts w:hint="default" w:ascii="Times New Roman" w:hAnsi="Times New Roman" w:eastAsia="SimSun" w:cs="Times New Roman"/>
+                <w:kern w:val="0"/>
+                <w:sz w:val="20"/>
+                <w:szCs w:val="20"/>
                 <w:lang w:val="en-US" w:eastAsia="zh-CN" w:bidi="ar"/>
               </w:rPr>
               <w:t>Sửa lỗi hiển thị sai cước sau khuyến mãi</w:t>
@@ -765,23 +945,28 @@
         <w:tc>
           <w:tcPr>
             <w:tcW w:w="0" w:type="auto"/>
-            <w:shd w:val="clear"/>
-            <w:vAlign w:val="center"/>
-          </w:tcPr>
-          <w:p>
-            <w:pPr>
-              <w:keepNext w:val="0"/>
-              <w:keepLines w:val="0"/>
-              <w:widowControl/>
-              <w:suppressLineNumbers w:val="0"/>
-              <w:jc w:val="left"/>
-            </w:pPr>
-            <w:r>
-              <w:rPr>
-                <w:rFonts w:ascii="SimSun" w:hAnsi="SimSun" w:eastAsia="SimSun" w:cs="SimSun"/>
-                <w:kern w:val="0"/>
-                <w:sz w:val="24"/>
-                <w:szCs w:val="24"/>
+            <w:shd w:val="clear" w:color="auto" w:fill="auto"/>
+            <w:vAlign w:val="center"/>
+          </w:tcPr>
+          <w:p>
+            <w:pPr>
+              <w:keepNext w:val="0"/>
+              <w:keepLines w:val="0"/>
+              <w:widowControl/>
+              <w:suppressLineNumbers w:val="0"/>
+              <w:jc w:val="left"/>
+              <w:rPr>
+                <w:rFonts w:hint="default" w:ascii="Times New Roman" w:hAnsi="Times New Roman" w:cs="Times New Roman"/>
+                <w:sz w:val="20"/>
+                <w:szCs w:val="20"/>
+              </w:rPr>
+            </w:pPr>
+            <w:r>
+              <w:rPr>
+                <w:rFonts w:hint="default" w:ascii="Times New Roman" w:hAnsi="Times New Roman" w:eastAsia="SimSun" w:cs="Times New Roman"/>
+                <w:kern w:val="0"/>
+                <w:sz w:val="20"/>
+                <w:szCs w:val="20"/>
                 <w:lang w:val="en-US" w:eastAsia="zh-CN" w:bidi="ar"/>
               </w:rPr>
               <w:t>2</w:t>
@@ -791,23 +976,28 @@
         <w:tc>
           <w:tcPr>
             <w:tcW w:w="0" w:type="auto"/>
-            <w:shd w:val="clear"/>
-            <w:vAlign w:val="center"/>
-          </w:tcPr>
-          <w:p>
-            <w:pPr>
-              <w:keepNext w:val="0"/>
-              <w:keepLines w:val="0"/>
-              <w:widowControl/>
-              <w:suppressLineNumbers w:val="0"/>
-              <w:jc w:val="left"/>
-            </w:pPr>
-            <w:r>
-              <w:rPr>
-                <w:rFonts w:ascii="SimSun" w:hAnsi="SimSun" w:eastAsia="SimSun" w:cs="SimSun"/>
-                <w:kern w:val="0"/>
-                <w:sz w:val="24"/>
-                <w:szCs w:val="24"/>
+            <w:shd w:val="clear" w:color="auto" w:fill="auto"/>
+            <w:vAlign w:val="center"/>
+          </w:tcPr>
+          <w:p>
+            <w:pPr>
+              <w:keepNext w:val="0"/>
+              <w:keepLines w:val="0"/>
+              <w:widowControl/>
+              <w:suppressLineNumbers w:val="0"/>
+              <w:jc w:val="left"/>
+              <w:rPr>
+                <w:rFonts w:hint="default" w:ascii="Times New Roman" w:hAnsi="Times New Roman" w:cs="Times New Roman"/>
+                <w:sz w:val="20"/>
+                <w:szCs w:val="20"/>
+              </w:rPr>
+            </w:pPr>
+            <w:r>
+              <w:rPr>
+                <w:rFonts w:hint="default" w:ascii="Times New Roman" w:hAnsi="Times New Roman" w:eastAsia="SimSun" w:cs="Times New Roman"/>
+                <w:kern w:val="0"/>
+                <w:sz w:val="20"/>
+                <w:szCs w:val="20"/>
                 <w:lang w:val="en-US" w:eastAsia="zh-CN" w:bidi="ar"/>
               </w:rPr>
               <w:t>Must</w:t>
@@ -817,23 +1007,28 @@
         <w:tc>
           <w:tcPr>
             <w:tcW w:w="0" w:type="auto"/>
-            <w:shd w:val="clear"/>
-            <w:vAlign w:val="center"/>
-          </w:tcPr>
-          <w:p>
-            <w:pPr>
-              <w:keepNext w:val="0"/>
-              <w:keepLines w:val="0"/>
-              <w:widowControl/>
-              <w:suppressLineNumbers w:val="0"/>
-              <w:jc w:val="left"/>
-            </w:pPr>
-            <w:r>
-              <w:rPr>
-                <w:rFonts w:ascii="SimSun" w:hAnsi="SimSun" w:eastAsia="SimSun" w:cs="SimSun"/>
-                <w:kern w:val="0"/>
-                <w:sz w:val="24"/>
-                <w:szCs w:val="24"/>
+            <w:shd w:val="clear" w:color="auto" w:fill="auto"/>
+            <w:vAlign w:val="center"/>
+          </w:tcPr>
+          <w:p>
+            <w:pPr>
+              <w:keepNext w:val="0"/>
+              <w:keepLines w:val="0"/>
+              <w:widowControl/>
+              <w:suppressLineNumbers w:val="0"/>
+              <w:jc w:val="left"/>
+              <w:rPr>
+                <w:rFonts w:hint="default" w:ascii="Times New Roman" w:hAnsi="Times New Roman" w:cs="Times New Roman"/>
+                <w:sz w:val="20"/>
+                <w:szCs w:val="20"/>
+              </w:rPr>
+            </w:pPr>
+            <w:r>
+              <w:rPr>
+                <w:rFonts w:hint="default" w:ascii="Times New Roman" w:hAnsi="Times New Roman" w:eastAsia="SimSun" w:cs="Times New Roman"/>
+                <w:kern w:val="0"/>
+                <w:sz w:val="20"/>
+                <w:szCs w:val="20"/>
                 <w:lang w:val="en-US" w:eastAsia="zh-CN" w:bidi="ar"/>
               </w:rPr>
               <w:t>Đang thu sai tiền khách nên bắt buộc phải sửa trước khi phát hành.</w:t>
@@ -851,7 +1046,7 @@
             <w:insideH w:val="single" w:color="auto" w:sz="4" w:space="0"/>
             <w:insideV w:val="single" w:color="auto" w:sz="4" w:space="0"/>
           </w:tblBorders>
-          <w:shd w:val="clear"/>
+          <w:shd w:val="clear" w:color="auto" w:fill="auto"/>
           <w:tblCellMar>
             <w:top w:w="14" w:type="dxa"/>
             <w:left w:w="15" w:type="dxa"/>
@@ -862,23 +1057,28 @@
         <w:tc>
           <w:tcPr>
             <w:tcW w:w="0" w:type="auto"/>
-            <w:shd w:val="clear"/>
-            <w:vAlign w:val="center"/>
-          </w:tcPr>
-          <w:p>
-            <w:pPr>
-              <w:keepNext w:val="0"/>
-              <w:keepLines w:val="0"/>
-              <w:widowControl/>
-              <w:suppressLineNumbers w:val="0"/>
-              <w:jc w:val="left"/>
-            </w:pPr>
-            <w:r>
-              <w:rPr>
-                <w:rFonts w:ascii="SimSun" w:hAnsi="SimSun" w:eastAsia="SimSun" w:cs="SimSun"/>
-                <w:kern w:val="0"/>
-                <w:sz w:val="24"/>
-                <w:szCs w:val="24"/>
+            <w:shd w:val="clear" w:color="auto" w:fill="auto"/>
+            <w:vAlign w:val="center"/>
+          </w:tcPr>
+          <w:p>
+            <w:pPr>
+              <w:keepNext w:val="0"/>
+              <w:keepLines w:val="0"/>
+              <w:widowControl/>
+              <w:suppressLineNumbers w:val="0"/>
+              <w:jc w:val="left"/>
+              <w:rPr>
+                <w:rFonts w:hint="default" w:ascii="Times New Roman" w:hAnsi="Times New Roman" w:cs="Times New Roman"/>
+                <w:sz w:val="20"/>
+                <w:szCs w:val="20"/>
+              </w:rPr>
+            </w:pPr>
+            <w:r>
+              <w:rPr>
+                <w:rFonts w:hint="default" w:ascii="Times New Roman" w:hAnsi="Times New Roman" w:eastAsia="SimSun" w:cs="Times New Roman"/>
+                <w:kern w:val="0"/>
+                <w:sz w:val="20"/>
+                <w:szCs w:val="20"/>
                 <w:lang w:val="en-US" w:eastAsia="zh-CN" w:bidi="ar"/>
               </w:rPr>
               <w:t>2</w:t>
@@ -888,23 +1088,28 @@
         <w:tc>
           <w:tcPr>
             <w:tcW w:w="0" w:type="auto"/>
-            <w:shd w:val="clear"/>
-            <w:vAlign w:val="center"/>
-          </w:tcPr>
-          <w:p>
-            <w:pPr>
-              <w:keepNext w:val="0"/>
-              <w:keepLines w:val="0"/>
-              <w:widowControl/>
-              <w:suppressLineNumbers w:val="0"/>
-              <w:jc w:val="left"/>
-            </w:pPr>
-            <w:r>
-              <w:rPr>
-                <w:rFonts w:ascii="SimSun" w:hAnsi="SimSun" w:eastAsia="SimSun" w:cs="SimSun"/>
-                <w:kern w:val="0"/>
-                <w:sz w:val="24"/>
-                <w:szCs w:val="24"/>
+            <w:shd w:val="clear" w:color="auto" w:fill="auto"/>
+            <w:vAlign w:val="center"/>
+          </w:tcPr>
+          <w:p>
+            <w:pPr>
+              <w:keepNext w:val="0"/>
+              <w:keepLines w:val="0"/>
+              <w:widowControl/>
+              <w:suppressLineNumbers w:val="0"/>
+              <w:jc w:val="left"/>
+              <w:rPr>
+                <w:rFonts w:hint="default" w:ascii="Times New Roman" w:hAnsi="Times New Roman" w:cs="Times New Roman"/>
+                <w:sz w:val="20"/>
+                <w:szCs w:val="20"/>
+              </w:rPr>
+            </w:pPr>
+            <w:r>
+              <w:rPr>
+                <w:rFonts w:hint="default" w:ascii="Times New Roman" w:hAnsi="Times New Roman" w:eastAsia="SimSun" w:cs="Times New Roman"/>
+                <w:kern w:val="0"/>
+                <w:sz w:val="20"/>
+                <w:szCs w:val="20"/>
                 <w:lang w:val="en-US" w:eastAsia="zh-CN" w:bidi="ar"/>
               </w:rPr>
               <w:t>Áp mã khuyến mãi khi đặt xe</w:t>
@@ -914,23 +1119,28 @@
         <w:tc>
           <w:tcPr>
             <w:tcW w:w="0" w:type="auto"/>
-            <w:shd w:val="clear"/>
-            <w:vAlign w:val="center"/>
-          </w:tcPr>
-          <w:p>
-            <w:pPr>
-              <w:keepNext w:val="0"/>
-              <w:keepLines w:val="0"/>
-              <w:widowControl/>
-              <w:suppressLineNumbers w:val="0"/>
-              <w:jc w:val="left"/>
-            </w:pPr>
-            <w:r>
-              <w:rPr>
-                <w:rFonts w:ascii="SimSun" w:hAnsi="SimSun" w:eastAsia="SimSun" w:cs="SimSun"/>
-                <w:kern w:val="0"/>
-                <w:sz w:val="24"/>
-                <w:szCs w:val="24"/>
+            <w:shd w:val="clear" w:color="auto" w:fill="auto"/>
+            <w:vAlign w:val="center"/>
+          </w:tcPr>
+          <w:p>
+            <w:pPr>
+              <w:keepNext w:val="0"/>
+              <w:keepLines w:val="0"/>
+              <w:widowControl/>
+              <w:suppressLineNumbers w:val="0"/>
+              <w:jc w:val="left"/>
+              <w:rPr>
+                <w:rFonts w:hint="default" w:ascii="Times New Roman" w:hAnsi="Times New Roman" w:cs="Times New Roman"/>
+                <w:sz w:val="20"/>
+                <w:szCs w:val="20"/>
+              </w:rPr>
+            </w:pPr>
+            <w:r>
+              <w:rPr>
+                <w:rFonts w:hint="default" w:ascii="Times New Roman" w:hAnsi="Times New Roman" w:eastAsia="SimSun" w:cs="Times New Roman"/>
+                <w:kern w:val="0"/>
+                <w:sz w:val="20"/>
+                <w:szCs w:val="20"/>
                 <w:lang w:val="en-US" w:eastAsia="zh-CN" w:bidi="ar"/>
               </w:rPr>
               <w:t>2</w:t>
@@ -940,23 +1150,28 @@
         <w:tc>
           <w:tcPr>
             <w:tcW w:w="0" w:type="auto"/>
-            <w:shd w:val="clear"/>
-            <w:vAlign w:val="center"/>
-          </w:tcPr>
-          <w:p>
-            <w:pPr>
-              <w:keepNext w:val="0"/>
-              <w:keepLines w:val="0"/>
-              <w:widowControl/>
-              <w:suppressLineNumbers w:val="0"/>
-              <w:jc w:val="left"/>
-            </w:pPr>
-            <w:r>
-              <w:rPr>
-                <w:rFonts w:ascii="SimSun" w:hAnsi="SimSun" w:eastAsia="SimSun" w:cs="SimSun"/>
-                <w:kern w:val="0"/>
-                <w:sz w:val="24"/>
-                <w:szCs w:val="24"/>
+            <w:shd w:val="clear" w:color="auto" w:fill="auto"/>
+            <w:vAlign w:val="center"/>
+          </w:tcPr>
+          <w:p>
+            <w:pPr>
+              <w:keepNext w:val="0"/>
+              <w:keepLines w:val="0"/>
+              <w:widowControl/>
+              <w:suppressLineNumbers w:val="0"/>
+              <w:jc w:val="left"/>
+              <w:rPr>
+                <w:rFonts w:hint="default" w:ascii="Times New Roman" w:hAnsi="Times New Roman" w:cs="Times New Roman"/>
+                <w:sz w:val="20"/>
+                <w:szCs w:val="20"/>
+              </w:rPr>
+            </w:pPr>
+            <w:r>
+              <w:rPr>
+                <w:rFonts w:hint="default" w:ascii="Times New Roman" w:hAnsi="Times New Roman" w:eastAsia="SimSun" w:cs="Times New Roman"/>
+                <w:kern w:val="0"/>
+                <w:sz w:val="20"/>
+                <w:szCs w:val="20"/>
                 <w:lang w:val="en-US" w:eastAsia="zh-CN" w:bidi="ar"/>
               </w:rPr>
               <w:t>Must</w:t>
@@ -966,23 +1181,28 @@
         <w:tc>
           <w:tcPr>
             <w:tcW w:w="0" w:type="auto"/>
-            <w:shd w:val="clear"/>
-            <w:vAlign w:val="center"/>
-          </w:tcPr>
-          <w:p>
-            <w:pPr>
-              <w:keepNext w:val="0"/>
-              <w:keepLines w:val="0"/>
-              <w:widowControl/>
-              <w:suppressLineNumbers w:val="0"/>
-              <w:jc w:val="left"/>
-            </w:pPr>
-            <w:r>
-              <w:rPr>
-                <w:rFonts w:ascii="SimSun" w:hAnsi="SimSun" w:eastAsia="SimSun" w:cs="SimSun"/>
-                <w:kern w:val="0"/>
-                <w:sz w:val="24"/>
-                <w:szCs w:val="24"/>
+            <w:shd w:val="clear" w:color="auto" w:fill="auto"/>
+            <w:vAlign w:val="center"/>
+          </w:tcPr>
+          <w:p>
+            <w:pPr>
+              <w:keepNext w:val="0"/>
+              <w:keepLines w:val="0"/>
+              <w:widowControl/>
+              <w:suppressLineNumbers w:val="0"/>
+              <w:jc w:val="left"/>
+              <w:rPr>
+                <w:rFonts w:hint="default" w:ascii="Times New Roman" w:hAnsi="Times New Roman" w:cs="Times New Roman"/>
+                <w:sz w:val="20"/>
+                <w:szCs w:val="20"/>
+              </w:rPr>
+            </w:pPr>
+            <w:r>
+              <w:rPr>
+                <w:rFonts w:hint="default" w:ascii="Times New Roman" w:hAnsi="Times New Roman" w:eastAsia="SimSun" w:cs="Times New Roman"/>
+                <w:kern w:val="0"/>
+                <w:sz w:val="20"/>
+                <w:szCs w:val="20"/>
                 <w:lang w:val="en-US" w:eastAsia="zh-CN" w:bidi="ar"/>
               </w:rPr>
               <w:t>Là chức năng chính để khách sử dụng chương trình khuyến mãi của bản phát hành.</w:t>
@@ -1000,7 +1220,7 @@
             <w:insideH w:val="single" w:color="auto" w:sz="4" w:space="0"/>
             <w:insideV w:val="single" w:color="auto" w:sz="4" w:space="0"/>
           </w:tblBorders>
-          <w:shd w:val="clear"/>
+          <w:shd w:val="clear" w:color="auto" w:fill="auto"/>
           <w:tblCellMar>
             <w:top w:w="14" w:type="dxa"/>
             <w:left w:w="15" w:type="dxa"/>
@@ -1011,23 +1231,28 @@
         <w:tc>
           <w:tcPr>
             <w:tcW w:w="0" w:type="auto"/>
-            <w:shd w:val="clear"/>
-            <w:vAlign w:val="center"/>
-          </w:tcPr>
-          <w:p>
-            <w:pPr>
-              <w:keepNext w:val="0"/>
-              <w:keepLines w:val="0"/>
-              <w:widowControl/>
-              <w:suppressLineNumbers w:val="0"/>
-              <w:jc w:val="left"/>
-            </w:pPr>
-            <w:r>
-              <w:rPr>
-                <w:rFonts w:ascii="SimSun" w:hAnsi="SimSun" w:eastAsia="SimSun" w:cs="SimSun"/>
-                <w:kern w:val="0"/>
-                <w:sz w:val="24"/>
-                <w:szCs w:val="24"/>
+            <w:shd w:val="clear" w:color="auto" w:fill="auto"/>
+            <w:vAlign w:val="center"/>
+          </w:tcPr>
+          <w:p>
+            <w:pPr>
+              <w:keepNext w:val="0"/>
+              <w:keepLines w:val="0"/>
+              <w:widowControl/>
+              <w:suppressLineNumbers w:val="0"/>
+              <w:jc w:val="left"/>
+              <w:rPr>
+                <w:rFonts w:hint="default" w:ascii="Times New Roman" w:hAnsi="Times New Roman" w:cs="Times New Roman"/>
+                <w:sz w:val="20"/>
+                <w:szCs w:val="20"/>
+              </w:rPr>
+            </w:pPr>
+            <w:r>
+              <w:rPr>
+                <w:rFonts w:hint="default" w:ascii="Times New Roman" w:hAnsi="Times New Roman" w:eastAsia="SimSun" w:cs="Times New Roman"/>
+                <w:kern w:val="0"/>
+                <w:sz w:val="20"/>
+                <w:szCs w:val="20"/>
                 <w:lang w:val="en-US" w:eastAsia="zh-CN" w:bidi="ar"/>
               </w:rPr>
               <w:t>3</w:t>
@@ -1037,23 +1262,28 @@
         <w:tc>
           <w:tcPr>
             <w:tcW w:w="0" w:type="auto"/>
-            <w:shd w:val="clear"/>
-            <w:vAlign w:val="center"/>
-          </w:tcPr>
-          <w:p>
-            <w:pPr>
-              <w:keepNext w:val="0"/>
-              <w:keepLines w:val="0"/>
-              <w:widowControl/>
-              <w:suppressLineNumbers w:val="0"/>
-              <w:jc w:val="left"/>
-            </w:pPr>
-            <w:r>
-              <w:rPr>
-                <w:rFonts w:ascii="SimSun" w:hAnsi="SimSun" w:eastAsia="SimSun" w:cs="SimSun"/>
-                <w:kern w:val="0"/>
-                <w:sz w:val="24"/>
-                <w:szCs w:val="24"/>
+            <w:shd w:val="clear" w:color="auto" w:fill="auto"/>
+            <w:vAlign w:val="center"/>
+          </w:tcPr>
+          <w:p>
+            <w:pPr>
+              <w:keepNext w:val="0"/>
+              <w:keepLines w:val="0"/>
+              <w:widowControl/>
+              <w:suppressLineNumbers w:val="0"/>
+              <w:jc w:val="left"/>
+              <w:rPr>
+                <w:rFonts w:hint="default" w:ascii="Times New Roman" w:hAnsi="Times New Roman" w:cs="Times New Roman"/>
+                <w:sz w:val="20"/>
+                <w:szCs w:val="20"/>
+              </w:rPr>
+            </w:pPr>
+            <w:r>
+              <w:rPr>
+                <w:rFonts w:hint="default" w:ascii="Times New Roman" w:hAnsi="Times New Roman" w:eastAsia="SimSun" w:cs="Times New Roman"/>
+                <w:kern w:val="0"/>
+                <w:sz w:val="20"/>
+                <w:szCs w:val="20"/>
                 <w:lang w:val="en-US" w:eastAsia="zh-CN" w:bidi="ar"/>
               </w:rPr>
               <w:t>Thanh toán bằng ví RikkeiPay</w:t>
@@ -1063,23 +1293,28 @@
         <w:tc>
           <w:tcPr>
             <w:tcW w:w="0" w:type="auto"/>
-            <w:shd w:val="clear"/>
-            <w:vAlign w:val="center"/>
-          </w:tcPr>
-          <w:p>
-            <w:pPr>
-              <w:keepNext w:val="0"/>
-              <w:keepLines w:val="0"/>
-              <w:widowControl/>
-              <w:suppressLineNumbers w:val="0"/>
-              <w:jc w:val="left"/>
-            </w:pPr>
-            <w:r>
-              <w:rPr>
-                <w:rFonts w:ascii="SimSun" w:hAnsi="SimSun" w:eastAsia="SimSun" w:cs="SimSun"/>
-                <w:kern w:val="0"/>
-                <w:sz w:val="24"/>
-                <w:szCs w:val="24"/>
+            <w:shd w:val="clear" w:color="auto" w:fill="auto"/>
+            <w:vAlign w:val="center"/>
+          </w:tcPr>
+          <w:p>
+            <w:pPr>
+              <w:keepNext w:val="0"/>
+              <w:keepLines w:val="0"/>
+              <w:widowControl/>
+              <w:suppressLineNumbers w:val="0"/>
+              <w:jc w:val="left"/>
+              <w:rPr>
+                <w:rFonts w:hint="default" w:ascii="Times New Roman" w:hAnsi="Times New Roman" w:cs="Times New Roman"/>
+                <w:sz w:val="20"/>
+                <w:szCs w:val="20"/>
+              </w:rPr>
+            </w:pPr>
+            <w:r>
+              <w:rPr>
+                <w:rFonts w:hint="default" w:ascii="Times New Roman" w:hAnsi="Times New Roman" w:eastAsia="SimSun" w:cs="Times New Roman"/>
+                <w:kern w:val="0"/>
+                <w:sz w:val="20"/>
+                <w:szCs w:val="20"/>
                 <w:lang w:val="en-US" w:eastAsia="zh-CN" w:bidi="ar"/>
               </w:rPr>
               <w:t>3</w:t>
@@ -1089,23 +1324,28 @@
         <w:tc>
           <w:tcPr>
             <w:tcW w:w="0" w:type="auto"/>
-            <w:shd w:val="clear"/>
-            <w:vAlign w:val="center"/>
-          </w:tcPr>
-          <w:p>
-            <w:pPr>
-              <w:keepNext w:val="0"/>
-              <w:keepLines w:val="0"/>
-              <w:widowControl/>
-              <w:suppressLineNumbers w:val="0"/>
-              <w:jc w:val="left"/>
-            </w:pPr>
-            <w:r>
-              <w:rPr>
-                <w:rFonts w:ascii="SimSun" w:hAnsi="SimSun" w:eastAsia="SimSun" w:cs="SimSun"/>
-                <w:kern w:val="0"/>
-                <w:sz w:val="24"/>
-                <w:szCs w:val="24"/>
+            <w:shd w:val="clear" w:color="auto" w:fill="auto"/>
+            <w:vAlign w:val="center"/>
+          </w:tcPr>
+          <w:p>
+            <w:pPr>
+              <w:keepNext w:val="0"/>
+              <w:keepLines w:val="0"/>
+              <w:widowControl/>
+              <w:suppressLineNumbers w:val="0"/>
+              <w:jc w:val="left"/>
+              <w:rPr>
+                <w:rFonts w:hint="default" w:ascii="Times New Roman" w:hAnsi="Times New Roman" w:cs="Times New Roman"/>
+                <w:sz w:val="20"/>
+                <w:szCs w:val="20"/>
+              </w:rPr>
+            </w:pPr>
+            <w:r>
+              <w:rPr>
+                <w:rFonts w:hint="default" w:ascii="Times New Roman" w:hAnsi="Times New Roman" w:eastAsia="SimSun" w:cs="Times New Roman"/>
+                <w:kern w:val="0"/>
+                <w:sz w:val="20"/>
+                <w:szCs w:val="20"/>
                 <w:lang w:val="en-US" w:eastAsia="zh-CN" w:bidi="ar"/>
               </w:rPr>
               <w:t>Should</w:t>
@@ -1115,23 +1355,28 @@
         <w:tc>
           <w:tcPr>
             <w:tcW w:w="0" w:type="auto"/>
-            <w:shd w:val="clear"/>
-            <w:vAlign w:val="center"/>
-          </w:tcPr>
-          <w:p>
-            <w:pPr>
-              <w:keepNext w:val="0"/>
-              <w:keepLines w:val="0"/>
-              <w:widowControl/>
-              <w:suppressLineNumbers w:val="0"/>
-              <w:jc w:val="left"/>
-            </w:pPr>
-            <w:r>
-              <w:rPr>
-                <w:rFonts w:ascii="SimSun" w:hAnsi="SimSun" w:eastAsia="SimSun" w:cs="SimSun"/>
-                <w:kern w:val="0"/>
-                <w:sz w:val="24"/>
-                <w:szCs w:val="24"/>
+            <w:shd w:val="clear" w:color="auto" w:fill="auto"/>
+            <w:vAlign w:val="center"/>
+          </w:tcPr>
+          <w:p>
+            <w:pPr>
+              <w:keepNext w:val="0"/>
+              <w:keepLines w:val="0"/>
+              <w:widowControl/>
+              <w:suppressLineNumbers w:val="0"/>
+              <w:jc w:val="left"/>
+              <w:rPr>
+                <w:rFonts w:hint="default" w:ascii="Times New Roman" w:hAnsi="Times New Roman" w:cs="Times New Roman"/>
+                <w:sz w:val="20"/>
+                <w:szCs w:val="20"/>
+              </w:rPr>
+            </w:pPr>
+            <w:r>
+              <w:rPr>
+                <w:rFonts w:hint="default" w:ascii="Times New Roman" w:hAnsi="Times New Roman" w:eastAsia="SimSun" w:cs="Times New Roman"/>
+                <w:kern w:val="0"/>
+                <w:sz w:val="20"/>
+                <w:szCs w:val="20"/>
                 <w:lang w:val="en-US" w:eastAsia="zh-CN" w:bidi="ar"/>
               </w:rPr>
               <w:t>Khách vẫn có thể thanh toán bằng tiền mặt nên chức năng này chưa bắt buộc.</w:t>
@@ -1149,7 +1394,7 @@
             <w:insideH w:val="single" w:color="auto" w:sz="4" w:space="0"/>
             <w:insideV w:val="single" w:color="auto" w:sz="4" w:space="0"/>
           </w:tblBorders>
-          <w:shd w:val="clear"/>
+          <w:shd w:val="clear" w:color="auto" w:fill="auto"/>
           <w:tblCellMar>
             <w:top w:w="14" w:type="dxa"/>
             <w:left w:w="15" w:type="dxa"/>
@@ -1160,23 +1405,28 @@
         <w:tc>
           <w:tcPr>
             <w:tcW w:w="0" w:type="auto"/>
-            <w:shd w:val="clear"/>
-            <w:vAlign w:val="center"/>
-          </w:tcPr>
-          <w:p>
-            <w:pPr>
-              <w:keepNext w:val="0"/>
-              <w:keepLines w:val="0"/>
-              <w:widowControl/>
-              <w:suppressLineNumbers w:val="0"/>
-              <w:jc w:val="left"/>
-            </w:pPr>
-            <w:r>
-              <w:rPr>
-                <w:rFonts w:ascii="SimSun" w:hAnsi="SimSun" w:eastAsia="SimSun" w:cs="SimSun"/>
-                <w:kern w:val="0"/>
-                <w:sz w:val="24"/>
-                <w:szCs w:val="24"/>
+            <w:shd w:val="clear" w:color="auto" w:fill="auto"/>
+            <w:vAlign w:val="center"/>
+          </w:tcPr>
+          <w:p>
+            <w:pPr>
+              <w:keepNext w:val="0"/>
+              <w:keepLines w:val="0"/>
+              <w:widowControl/>
+              <w:suppressLineNumbers w:val="0"/>
+              <w:jc w:val="left"/>
+              <w:rPr>
+                <w:rFonts w:hint="default" w:ascii="Times New Roman" w:hAnsi="Times New Roman" w:cs="Times New Roman"/>
+                <w:sz w:val="20"/>
+                <w:szCs w:val="20"/>
+              </w:rPr>
+            </w:pPr>
+            <w:r>
+              <w:rPr>
+                <w:rFonts w:hint="default" w:ascii="Times New Roman" w:hAnsi="Times New Roman" w:eastAsia="SimSun" w:cs="Times New Roman"/>
+                <w:kern w:val="0"/>
+                <w:sz w:val="20"/>
+                <w:szCs w:val="20"/>
                 <w:lang w:val="en-US" w:eastAsia="zh-CN" w:bidi="ar"/>
               </w:rPr>
               <w:t>4</w:t>
@@ -1186,23 +1436,28 @@
         <w:tc>
           <w:tcPr>
             <w:tcW w:w="0" w:type="auto"/>
-            <w:shd w:val="clear"/>
-            <w:vAlign w:val="center"/>
-          </w:tcPr>
-          <w:p>
-            <w:pPr>
-              <w:keepNext w:val="0"/>
-              <w:keepLines w:val="0"/>
-              <w:widowControl/>
-              <w:suppressLineNumbers w:val="0"/>
-              <w:jc w:val="left"/>
-            </w:pPr>
-            <w:r>
-              <w:rPr>
-                <w:rFonts w:ascii="SimSun" w:hAnsi="SimSun" w:eastAsia="SimSun" w:cs="SimSun"/>
-                <w:kern w:val="0"/>
-                <w:sz w:val="24"/>
-                <w:szCs w:val="24"/>
+            <w:shd w:val="clear" w:color="auto" w:fill="auto"/>
+            <w:vAlign w:val="center"/>
+          </w:tcPr>
+          <w:p>
+            <w:pPr>
+              <w:keepNext w:val="0"/>
+              <w:keepLines w:val="0"/>
+              <w:widowControl/>
+              <w:suppressLineNumbers w:val="0"/>
+              <w:jc w:val="left"/>
+              <w:rPr>
+                <w:rFonts w:hint="default" w:ascii="Times New Roman" w:hAnsi="Times New Roman" w:cs="Times New Roman"/>
+                <w:sz w:val="20"/>
+                <w:szCs w:val="20"/>
+              </w:rPr>
+            </w:pPr>
+            <w:r>
+              <w:rPr>
+                <w:rFonts w:hint="default" w:ascii="Times New Roman" w:hAnsi="Times New Roman" w:eastAsia="SimSun" w:cs="Times New Roman"/>
+                <w:kern w:val="0"/>
+                <w:sz w:val="20"/>
+                <w:szCs w:val="20"/>
                 <w:lang w:val="en-US" w:eastAsia="zh-CN" w:bidi="ar"/>
               </w:rPr>
               <w:t>Hẹn giờ đặt xe trước</w:t>
@@ -1212,23 +1467,28 @@
         <w:tc>
           <w:tcPr>
             <w:tcW w:w="0" w:type="auto"/>
-            <w:shd w:val="clear"/>
-            <w:vAlign w:val="center"/>
-          </w:tcPr>
-          <w:p>
-            <w:pPr>
-              <w:keepNext w:val="0"/>
-              <w:keepLines w:val="0"/>
-              <w:widowControl/>
-              <w:suppressLineNumbers w:val="0"/>
-              <w:jc w:val="left"/>
-            </w:pPr>
-            <w:r>
-              <w:rPr>
-                <w:rFonts w:ascii="SimSun" w:hAnsi="SimSun" w:eastAsia="SimSun" w:cs="SimSun"/>
-                <w:kern w:val="0"/>
-                <w:sz w:val="24"/>
-                <w:szCs w:val="24"/>
+            <w:shd w:val="clear" w:color="auto" w:fill="auto"/>
+            <w:vAlign w:val="center"/>
+          </w:tcPr>
+          <w:p>
+            <w:pPr>
+              <w:keepNext w:val="0"/>
+              <w:keepLines w:val="0"/>
+              <w:widowControl/>
+              <w:suppressLineNumbers w:val="0"/>
+              <w:jc w:val="left"/>
+              <w:rPr>
+                <w:rFonts w:hint="default" w:ascii="Times New Roman" w:hAnsi="Times New Roman" w:cs="Times New Roman"/>
+                <w:sz w:val="20"/>
+                <w:szCs w:val="20"/>
+              </w:rPr>
+            </w:pPr>
+            <w:r>
+              <w:rPr>
+                <w:rFonts w:hint="default" w:ascii="Times New Roman" w:hAnsi="Times New Roman" w:eastAsia="SimSun" w:cs="Times New Roman"/>
+                <w:kern w:val="0"/>
+                <w:sz w:val="20"/>
+                <w:szCs w:val="20"/>
                 <w:lang w:val="en-US" w:eastAsia="zh-CN" w:bidi="ar"/>
               </w:rPr>
               <w:t>3</w:t>
@@ -1238,23 +1498,28 @@
         <w:tc>
           <w:tcPr>
             <w:tcW w:w="0" w:type="auto"/>
-            <w:shd w:val="clear"/>
-            <w:vAlign w:val="center"/>
-          </w:tcPr>
-          <w:p>
-            <w:pPr>
-              <w:keepNext w:val="0"/>
-              <w:keepLines w:val="0"/>
-              <w:widowControl/>
-              <w:suppressLineNumbers w:val="0"/>
-              <w:jc w:val="left"/>
-            </w:pPr>
-            <w:r>
-              <w:rPr>
-                <w:rFonts w:ascii="SimSun" w:hAnsi="SimSun" w:eastAsia="SimSun" w:cs="SimSun"/>
-                <w:kern w:val="0"/>
-                <w:sz w:val="24"/>
-                <w:szCs w:val="24"/>
+            <w:shd w:val="clear" w:color="auto" w:fill="auto"/>
+            <w:vAlign w:val="center"/>
+          </w:tcPr>
+          <w:p>
+            <w:pPr>
+              <w:keepNext w:val="0"/>
+              <w:keepLines w:val="0"/>
+              <w:widowControl/>
+              <w:suppressLineNumbers w:val="0"/>
+              <w:jc w:val="left"/>
+              <w:rPr>
+                <w:rFonts w:hint="default" w:ascii="Times New Roman" w:hAnsi="Times New Roman" w:cs="Times New Roman"/>
+                <w:sz w:val="20"/>
+                <w:szCs w:val="20"/>
+              </w:rPr>
+            </w:pPr>
+            <w:r>
+              <w:rPr>
+                <w:rFonts w:hint="default" w:ascii="Times New Roman" w:hAnsi="Times New Roman" w:eastAsia="SimSun" w:cs="Times New Roman"/>
+                <w:kern w:val="0"/>
+                <w:sz w:val="20"/>
+                <w:szCs w:val="20"/>
                 <w:lang w:val="en-US" w:eastAsia="zh-CN" w:bidi="ar"/>
               </w:rPr>
               <w:t>Could</w:t>
@@ -1264,23 +1529,28 @@
         <w:tc>
           <w:tcPr>
             <w:tcW w:w="0" w:type="auto"/>
-            <w:shd w:val="clear"/>
-            <w:vAlign w:val="center"/>
-          </w:tcPr>
-          <w:p>
-            <w:pPr>
-              <w:keepNext w:val="0"/>
-              <w:keepLines w:val="0"/>
-              <w:widowControl/>
-              <w:suppressLineNumbers w:val="0"/>
-              <w:jc w:val="left"/>
-            </w:pPr>
-            <w:r>
-              <w:rPr>
-                <w:rFonts w:ascii="SimSun" w:hAnsi="SimSun" w:eastAsia="SimSun" w:cs="SimSun"/>
-                <w:kern w:val="0"/>
-                <w:sz w:val="24"/>
-                <w:szCs w:val="24"/>
+            <w:shd w:val="clear" w:color="auto" w:fill="auto"/>
+            <w:vAlign w:val="center"/>
+          </w:tcPr>
+          <w:p>
+            <w:pPr>
+              <w:keepNext w:val="0"/>
+              <w:keepLines w:val="0"/>
+              <w:widowControl/>
+              <w:suppressLineNumbers w:val="0"/>
+              <w:jc w:val="left"/>
+              <w:rPr>
+                <w:rFonts w:hint="default" w:ascii="Times New Roman" w:hAnsi="Times New Roman" w:cs="Times New Roman"/>
+                <w:sz w:val="20"/>
+                <w:szCs w:val="20"/>
+              </w:rPr>
+            </w:pPr>
+            <w:r>
+              <w:rPr>
+                <w:rFonts w:hint="default" w:ascii="Times New Roman" w:hAnsi="Times New Roman" w:eastAsia="SimSun" w:cs="Times New Roman"/>
+                <w:kern w:val="0"/>
+                <w:sz w:val="20"/>
+                <w:szCs w:val="20"/>
                 <w:lang w:val="en-US" w:eastAsia="zh-CN" w:bidi="ar"/>
               </w:rPr>
               <w:t>Không ảnh hưởng đến khả năng đặt xe thông thường nên có thể phát triển sau.</w:t>
@@ -1298,7 +1568,7 @@
             <w:insideH w:val="single" w:color="auto" w:sz="4" w:space="0"/>
             <w:insideV w:val="single" w:color="auto" w:sz="4" w:space="0"/>
           </w:tblBorders>
-          <w:shd w:val="clear"/>
+          <w:shd w:val="clear" w:color="auto" w:fill="auto"/>
           <w:tblCellMar>
             <w:top w:w="14" w:type="dxa"/>
             <w:left w:w="15" w:type="dxa"/>
@@ -1309,23 +1579,28 @@
         <w:tc>
           <w:tcPr>
             <w:tcW w:w="0" w:type="auto"/>
-            <w:shd w:val="clear"/>
-            <w:vAlign w:val="center"/>
-          </w:tcPr>
-          <w:p>
-            <w:pPr>
-              <w:keepNext w:val="0"/>
-              <w:keepLines w:val="0"/>
-              <w:widowControl/>
-              <w:suppressLineNumbers w:val="0"/>
-              <w:jc w:val="left"/>
-            </w:pPr>
-            <w:r>
-              <w:rPr>
-                <w:rFonts w:ascii="SimSun" w:hAnsi="SimSun" w:eastAsia="SimSun" w:cs="SimSun"/>
-                <w:kern w:val="0"/>
-                <w:sz w:val="24"/>
-                <w:szCs w:val="24"/>
+            <w:shd w:val="clear" w:color="auto" w:fill="auto"/>
+            <w:vAlign w:val="center"/>
+          </w:tcPr>
+          <w:p>
+            <w:pPr>
+              <w:keepNext w:val="0"/>
+              <w:keepLines w:val="0"/>
+              <w:widowControl/>
+              <w:suppressLineNumbers w:val="0"/>
+              <w:jc w:val="left"/>
+              <w:rPr>
+                <w:rFonts w:hint="default" w:ascii="Times New Roman" w:hAnsi="Times New Roman" w:cs="Times New Roman"/>
+                <w:sz w:val="20"/>
+                <w:szCs w:val="20"/>
+              </w:rPr>
+            </w:pPr>
+            <w:r>
+              <w:rPr>
+                <w:rFonts w:hint="default" w:ascii="Times New Roman" w:hAnsi="Times New Roman" w:eastAsia="SimSun" w:cs="Times New Roman"/>
+                <w:kern w:val="0"/>
+                <w:sz w:val="20"/>
+                <w:szCs w:val="20"/>
                 <w:lang w:val="en-US" w:eastAsia="zh-CN" w:bidi="ar"/>
               </w:rPr>
               <w:t>5</w:t>
@@ -1335,23 +1610,28 @@
         <w:tc>
           <w:tcPr>
             <w:tcW w:w="0" w:type="auto"/>
-            <w:shd w:val="clear"/>
-            <w:vAlign w:val="center"/>
-          </w:tcPr>
-          <w:p>
-            <w:pPr>
-              <w:keepNext w:val="0"/>
-              <w:keepLines w:val="0"/>
-              <w:widowControl/>
-              <w:suppressLineNumbers w:val="0"/>
-              <w:jc w:val="left"/>
-            </w:pPr>
-            <w:r>
-              <w:rPr>
-                <w:rFonts w:ascii="SimSun" w:hAnsi="SimSun" w:eastAsia="SimSun" w:cs="SimSun"/>
-                <w:kern w:val="0"/>
-                <w:sz w:val="24"/>
-                <w:szCs w:val="24"/>
+            <w:shd w:val="clear" w:color="auto" w:fill="auto"/>
+            <w:vAlign w:val="center"/>
+          </w:tcPr>
+          <w:p>
+            <w:pPr>
+              <w:keepNext w:val="0"/>
+              <w:keepLines w:val="0"/>
+              <w:widowControl/>
+              <w:suppressLineNumbers w:val="0"/>
+              <w:jc w:val="left"/>
+              <w:rPr>
+                <w:rFonts w:hint="default" w:ascii="Times New Roman" w:hAnsi="Times New Roman" w:cs="Times New Roman"/>
+                <w:sz w:val="20"/>
+                <w:szCs w:val="20"/>
+              </w:rPr>
+            </w:pPr>
+            <w:r>
+              <w:rPr>
+                <w:rFonts w:hint="default" w:ascii="Times New Roman" w:hAnsi="Times New Roman" w:eastAsia="SimSun" w:cs="Times New Roman"/>
+                <w:kern w:val="0"/>
+                <w:sz w:val="20"/>
+                <w:szCs w:val="20"/>
                 <w:lang w:val="en-US" w:eastAsia="zh-CN" w:bidi="ar"/>
               </w:rPr>
               <w:t>Chat với tài xế</w:t>
@@ -1361,23 +1641,28 @@
         <w:tc>
           <w:tcPr>
             <w:tcW w:w="0" w:type="auto"/>
-            <w:shd w:val="clear"/>
-            <w:vAlign w:val="center"/>
-          </w:tcPr>
-          <w:p>
-            <w:pPr>
-              <w:keepNext w:val="0"/>
-              <w:keepLines w:val="0"/>
-              <w:widowControl/>
-              <w:suppressLineNumbers w:val="0"/>
-              <w:jc w:val="left"/>
-            </w:pPr>
-            <w:r>
-              <w:rPr>
-                <w:rFonts w:ascii="SimSun" w:hAnsi="SimSun" w:eastAsia="SimSun" w:cs="SimSun"/>
-                <w:kern w:val="0"/>
-                <w:sz w:val="24"/>
-                <w:szCs w:val="24"/>
+            <w:shd w:val="clear" w:color="auto" w:fill="auto"/>
+            <w:vAlign w:val="center"/>
+          </w:tcPr>
+          <w:p>
+            <w:pPr>
+              <w:keepNext w:val="0"/>
+              <w:keepLines w:val="0"/>
+              <w:widowControl/>
+              <w:suppressLineNumbers w:val="0"/>
+              <w:jc w:val="left"/>
+              <w:rPr>
+                <w:rFonts w:hint="default" w:ascii="Times New Roman" w:hAnsi="Times New Roman" w:cs="Times New Roman"/>
+                <w:sz w:val="20"/>
+                <w:szCs w:val="20"/>
+              </w:rPr>
+            </w:pPr>
+            <w:r>
+              <w:rPr>
+                <w:rFonts w:hint="default" w:ascii="Times New Roman" w:hAnsi="Times New Roman" w:eastAsia="SimSun" w:cs="Times New Roman"/>
+                <w:kern w:val="0"/>
+                <w:sz w:val="20"/>
+                <w:szCs w:val="20"/>
                 <w:lang w:val="en-US" w:eastAsia="zh-CN" w:bidi="ar"/>
               </w:rPr>
               <w:t>3</w:t>
@@ -1387,23 +1672,28 @@
         <w:tc>
           <w:tcPr>
             <w:tcW w:w="0" w:type="auto"/>
-            <w:shd w:val="clear"/>
-            <w:vAlign w:val="center"/>
-          </w:tcPr>
-          <w:p>
-            <w:pPr>
-              <w:keepNext w:val="0"/>
-              <w:keepLines w:val="0"/>
-              <w:widowControl/>
-              <w:suppressLineNumbers w:val="0"/>
-              <w:jc w:val="left"/>
-            </w:pPr>
-            <w:r>
-              <w:rPr>
-                <w:rFonts w:ascii="SimSun" w:hAnsi="SimSun" w:eastAsia="SimSun" w:cs="SimSun"/>
-                <w:kern w:val="0"/>
-                <w:sz w:val="24"/>
-                <w:szCs w:val="24"/>
+            <w:shd w:val="clear" w:color="auto" w:fill="auto"/>
+            <w:vAlign w:val="center"/>
+          </w:tcPr>
+          <w:p>
+            <w:pPr>
+              <w:keepNext w:val="0"/>
+              <w:keepLines w:val="0"/>
+              <w:widowControl/>
+              <w:suppressLineNumbers w:val="0"/>
+              <w:jc w:val="left"/>
+              <w:rPr>
+                <w:rFonts w:hint="default" w:ascii="Times New Roman" w:hAnsi="Times New Roman" w:cs="Times New Roman"/>
+                <w:sz w:val="20"/>
+                <w:szCs w:val="20"/>
+              </w:rPr>
+            </w:pPr>
+            <w:r>
+              <w:rPr>
+                <w:rFonts w:hint="default" w:ascii="Times New Roman" w:hAnsi="Times New Roman" w:eastAsia="SimSun" w:cs="Times New Roman"/>
+                <w:kern w:val="0"/>
+                <w:sz w:val="20"/>
+                <w:szCs w:val="20"/>
                 <w:lang w:val="en-US" w:eastAsia="zh-CN" w:bidi="ar"/>
               </w:rPr>
               <w:t>Could</w:t>
@@ -1413,23 +1703,28 @@
         <w:tc>
           <w:tcPr>
             <w:tcW w:w="0" w:type="auto"/>
-            <w:shd w:val="clear"/>
-            <w:vAlign w:val="center"/>
-          </w:tcPr>
-          <w:p>
-            <w:pPr>
-              <w:keepNext w:val="0"/>
-              <w:keepLines w:val="0"/>
-              <w:widowControl/>
-              <w:suppressLineNumbers w:val="0"/>
-              <w:jc w:val="left"/>
-            </w:pPr>
-            <w:r>
-              <w:rPr>
-                <w:rFonts w:ascii="SimSun" w:hAnsi="SimSun" w:eastAsia="SimSun" w:cs="SimSun"/>
-                <w:kern w:val="0"/>
-                <w:sz w:val="24"/>
-                <w:szCs w:val="24"/>
+            <w:shd w:val="clear" w:color="auto" w:fill="auto"/>
+            <w:vAlign w:val="center"/>
+          </w:tcPr>
+          <w:p>
+            <w:pPr>
+              <w:keepNext w:val="0"/>
+              <w:keepLines w:val="0"/>
+              <w:widowControl/>
+              <w:suppressLineNumbers w:val="0"/>
+              <w:jc w:val="left"/>
+              <w:rPr>
+                <w:rFonts w:hint="default" w:ascii="Times New Roman" w:hAnsi="Times New Roman" w:cs="Times New Roman"/>
+                <w:sz w:val="20"/>
+                <w:szCs w:val="20"/>
+              </w:rPr>
+            </w:pPr>
+            <w:r>
+              <w:rPr>
+                <w:rFonts w:hint="default" w:ascii="Times New Roman" w:hAnsi="Times New Roman" w:eastAsia="SimSun" w:cs="Times New Roman"/>
+                <w:kern w:val="0"/>
+                <w:sz w:val="20"/>
+                <w:szCs w:val="20"/>
                 <w:lang w:val="en-US" w:eastAsia="zh-CN" w:bidi="ar"/>
               </w:rPr>
               <w:t>Khách vẫn có thể gọi điện cho tài xế nên chưa cần thiết trong bản phát hành này.</w:t>
@@ -1447,7 +1742,7 @@
             <w:insideH w:val="single" w:color="auto" w:sz="4" w:space="0"/>
             <w:insideV w:val="single" w:color="auto" w:sz="4" w:space="0"/>
           </w:tblBorders>
-          <w:shd w:val="clear"/>
+          <w:shd w:val="clear" w:color="auto" w:fill="auto"/>
           <w:tblCellMar>
             <w:top w:w="14" w:type="dxa"/>
             <w:left w:w="15" w:type="dxa"/>
@@ -1458,23 +1753,28 @@
         <w:tc>
           <w:tcPr>
             <w:tcW w:w="0" w:type="auto"/>
-            <w:shd w:val="clear"/>
-            <w:vAlign w:val="center"/>
-          </w:tcPr>
-          <w:p>
-            <w:pPr>
-              <w:keepNext w:val="0"/>
-              <w:keepLines w:val="0"/>
-              <w:widowControl/>
-              <w:suppressLineNumbers w:val="0"/>
-              <w:jc w:val="left"/>
-            </w:pPr>
-            <w:r>
-              <w:rPr>
-                <w:rFonts w:ascii="SimSun" w:hAnsi="SimSun" w:eastAsia="SimSun" w:cs="SimSun"/>
-                <w:kern w:val="0"/>
-                <w:sz w:val="24"/>
-                <w:szCs w:val="24"/>
+            <w:shd w:val="clear" w:color="auto" w:fill="auto"/>
+            <w:vAlign w:val="center"/>
+          </w:tcPr>
+          <w:p>
+            <w:pPr>
+              <w:keepNext w:val="0"/>
+              <w:keepLines w:val="0"/>
+              <w:widowControl/>
+              <w:suppressLineNumbers w:val="0"/>
+              <w:jc w:val="left"/>
+              <w:rPr>
+                <w:rFonts w:hint="default" w:ascii="Times New Roman" w:hAnsi="Times New Roman" w:cs="Times New Roman"/>
+                <w:sz w:val="20"/>
+                <w:szCs w:val="20"/>
+              </w:rPr>
+            </w:pPr>
+            <w:r>
+              <w:rPr>
+                <w:rFonts w:hint="default" w:ascii="Times New Roman" w:hAnsi="Times New Roman" w:eastAsia="SimSun" w:cs="Times New Roman"/>
+                <w:kern w:val="0"/>
+                <w:sz w:val="20"/>
+                <w:szCs w:val="20"/>
                 <w:lang w:val="en-US" w:eastAsia="zh-CN" w:bidi="ar"/>
               </w:rPr>
               <w:t>6</w:t>
@@ -1484,23 +1784,28 @@
         <w:tc>
           <w:tcPr>
             <w:tcW w:w="0" w:type="auto"/>
-            <w:shd w:val="clear"/>
-            <w:vAlign w:val="center"/>
-          </w:tcPr>
-          <w:p>
-            <w:pPr>
-              <w:keepNext w:val="0"/>
-              <w:keepLines w:val="0"/>
-              <w:widowControl/>
-              <w:suppressLineNumbers w:val="0"/>
-              <w:jc w:val="left"/>
-            </w:pPr>
-            <w:r>
-              <w:rPr>
-                <w:rFonts w:ascii="SimSun" w:hAnsi="SimSun" w:eastAsia="SimSun" w:cs="SimSun"/>
-                <w:kern w:val="0"/>
-                <w:sz w:val="24"/>
-                <w:szCs w:val="24"/>
+            <w:shd w:val="clear" w:color="auto" w:fill="auto"/>
+            <w:vAlign w:val="center"/>
+          </w:tcPr>
+          <w:p>
+            <w:pPr>
+              <w:keepNext w:val="0"/>
+              <w:keepLines w:val="0"/>
+              <w:widowControl/>
+              <w:suppressLineNumbers w:val="0"/>
+              <w:jc w:val="left"/>
+              <w:rPr>
+                <w:rFonts w:hint="default" w:ascii="Times New Roman" w:hAnsi="Times New Roman" w:cs="Times New Roman"/>
+                <w:sz w:val="20"/>
+                <w:szCs w:val="20"/>
+              </w:rPr>
+            </w:pPr>
+            <w:r>
+              <w:rPr>
+                <w:rFonts w:hint="default" w:ascii="Times New Roman" w:hAnsi="Times New Roman" w:eastAsia="SimSun" w:cs="Times New Roman"/>
+                <w:kern w:val="0"/>
+                <w:sz w:val="20"/>
+                <w:szCs w:val="20"/>
                 <w:lang w:val="en-US" w:eastAsia="zh-CN" w:bidi="ar"/>
               </w:rPr>
               <w:t>Giao diện trang trí cho chương trình khuyến mãi</w:t>
@@ -1510,23 +1815,28 @@
         <w:tc>
           <w:tcPr>
             <w:tcW w:w="0" w:type="auto"/>
-            <w:shd w:val="clear"/>
-            <w:vAlign w:val="center"/>
-          </w:tcPr>
-          <w:p>
-            <w:pPr>
-              <w:keepNext w:val="0"/>
-              <w:keepLines w:val="0"/>
-              <w:widowControl/>
-              <w:suppressLineNumbers w:val="0"/>
-              <w:jc w:val="left"/>
-            </w:pPr>
-            <w:r>
-              <w:rPr>
-                <w:rFonts w:ascii="SimSun" w:hAnsi="SimSun" w:eastAsia="SimSun" w:cs="SimSun"/>
-                <w:kern w:val="0"/>
-                <w:sz w:val="24"/>
-                <w:szCs w:val="24"/>
+            <w:shd w:val="clear" w:color="auto" w:fill="auto"/>
+            <w:vAlign w:val="center"/>
+          </w:tcPr>
+          <w:p>
+            <w:pPr>
+              <w:keepNext w:val="0"/>
+              <w:keepLines w:val="0"/>
+              <w:widowControl/>
+              <w:suppressLineNumbers w:val="0"/>
+              <w:jc w:val="left"/>
+              <w:rPr>
+                <w:rFonts w:hint="default" w:ascii="Times New Roman" w:hAnsi="Times New Roman" w:cs="Times New Roman"/>
+                <w:sz w:val="20"/>
+                <w:szCs w:val="20"/>
+              </w:rPr>
+            </w:pPr>
+            <w:r>
+              <w:rPr>
+                <w:rFonts w:hint="default" w:ascii="Times New Roman" w:hAnsi="Times New Roman" w:eastAsia="SimSun" w:cs="Times New Roman"/>
+                <w:kern w:val="0"/>
+                <w:sz w:val="20"/>
+                <w:szCs w:val="20"/>
                 <w:lang w:val="en-US" w:eastAsia="zh-CN" w:bidi="ar"/>
               </w:rPr>
               <w:t>2</w:t>
@@ -1536,23 +1846,28 @@
         <w:tc>
           <w:tcPr>
             <w:tcW w:w="0" w:type="auto"/>
-            <w:shd w:val="clear"/>
-            <w:vAlign w:val="center"/>
-          </w:tcPr>
-          <w:p>
-            <w:pPr>
-              <w:keepNext w:val="0"/>
-              <w:keepLines w:val="0"/>
-              <w:widowControl/>
-              <w:suppressLineNumbers w:val="0"/>
-              <w:jc w:val="left"/>
-            </w:pPr>
-            <w:r>
-              <w:rPr>
-                <w:rFonts w:ascii="SimSun" w:hAnsi="SimSun" w:eastAsia="SimSun" w:cs="SimSun"/>
-                <w:kern w:val="0"/>
-                <w:sz w:val="24"/>
-                <w:szCs w:val="24"/>
+            <w:shd w:val="clear" w:color="auto" w:fill="auto"/>
+            <w:vAlign w:val="center"/>
+          </w:tcPr>
+          <w:p>
+            <w:pPr>
+              <w:keepNext w:val="0"/>
+              <w:keepLines w:val="0"/>
+              <w:widowControl/>
+              <w:suppressLineNumbers w:val="0"/>
+              <w:jc w:val="left"/>
+              <w:rPr>
+                <w:rFonts w:hint="default" w:ascii="Times New Roman" w:hAnsi="Times New Roman" w:cs="Times New Roman"/>
+                <w:sz w:val="20"/>
+                <w:szCs w:val="20"/>
+              </w:rPr>
+            </w:pPr>
+            <w:r>
+              <w:rPr>
+                <w:rFonts w:hint="default" w:ascii="Times New Roman" w:hAnsi="Times New Roman" w:eastAsia="SimSun" w:cs="Times New Roman"/>
+                <w:kern w:val="0"/>
+                <w:sz w:val="20"/>
+                <w:szCs w:val="20"/>
                 <w:lang w:val="en-US" w:eastAsia="zh-CN" w:bidi="ar"/>
               </w:rPr>
               <w:t>Should</w:t>
@@ -1562,23 +1877,28 @@
         <w:tc>
           <w:tcPr>
             <w:tcW w:w="0" w:type="auto"/>
-            <w:shd w:val="clear"/>
-            <w:vAlign w:val="center"/>
-          </w:tcPr>
-          <w:p>
-            <w:pPr>
-              <w:keepNext w:val="0"/>
-              <w:keepLines w:val="0"/>
-              <w:widowControl/>
-              <w:suppressLineNumbers w:val="0"/>
-              <w:jc w:val="left"/>
-            </w:pPr>
-            <w:r>
-              <w:rPr>
-                <w:rFonts w:ascii="SimSun" w:hAnsi="SimSun" w:eastAsia="SimSun" w:cs="SimSun"/>
-                <w:kern w:val="0"/>
-                <w:sz w:val="24"/>
-                <w:szCs w:val="24"/>
+            <w:shd w:val="clear" w:color="auto" w:fill="auto"/>
+            <w:vAlign w:val="center"/>
+          </w:tcPr>
+          <w:p>
+            <w:pPr>
+              <w:keepNext w:val="0"/>
+              <w:keepLines w:val="0"/>
+              <w:widowControl/>
+              <w:suppressLineNumbers w:val="0"/>
+              <w:jc w:val="left"/>
+              <w:rPr>
+                <w:rFonts w:hint="default" w:ascii="Times New Roman" w:hAnsi="Times New Roman" w:cs="Times New Roman"/>
+                <w:sz w:val="20"/>
+                <w:szCs w:val="20"/>
+              </w:rPr>
+            </w:pPr>
+            <w:r>
+              <w:rPr>
+                <w:rFonts w:hint="default" w:ascii="Times New Roman" w:hAnsi="Times New Roman" w:eastAsia="SimSun" w:cs="Times New Roman"/>
+                <w:kern w:val="0"/>
+                <w:sz w:val="20"/>
+                <w:szCs w:val="20"/>
                 <w:lang w:val="en-US" w:eastAsia="zh-CN" w:bidi="ar"/>
               </w:rPr>
               <w:t>Giúp chương trình hấp dẫn hơn nhưng không quyết định khả năng hoạt động của bản phát hành.</w:t>
@@ -1594,8 +1914,18 @@
         <w:keepLines w:val="0"/>
         <w:widowControl/>
         <w:suppressLineNumbers w:val="0"/>
+        <w:rPr>
+          <w:rFonts w:hint="default" w:ascii="Times New Roman" w:hAnsi="Times New Roman" w:cs="Times New Roman"/>
+          <w:sz w:val="20"/>
+          <w:szCs w:val="20"/>
+        </w:rPr>
       </w:pPr>
       <w:r>
+        <w:rPr>
+          <w:rFonts w:hint="default" w:ascii="Times New Roman" w:hAnsi="Times New Roman" w:cs="Times New Roman"/>
+          <w:sz w:val="20"/>
+          <w:szCs w:val="20"/>
+        </w:rPr>
         <w:t>3.3. Chốt danh sách vào Sprint</w:t>
       </w:r>
     </w:p>
@@ -1606,22 +1936,41 @@
         <w:keepLines w:val="0"/>
         <w:widowControl/>
         <w:suppressLineNumbers w:val="0"/>
+        <w:rPr>
+          <w:rFonts w:hint="default" w:ascii="Times New Roman" w:hAnsi="Times New Roman" w:cs="Times New Roman"/>
+          <w:sz w:val="20"/>
+          <w:szCs w:val="20"/>
+        </w:rPr>
       </w:pPr>
       <w:r>
+        <w:rPr>
+          <w:rFonts w:hint="default" w:ascii="Times New Roman" w:hAnsi="Times New Roman" w:cs="Times New Roman"/>
+          <w:sz w:val="20"/>
+          <w:szCs w:val="20"/>
+        </w:rPr>
         <w:t xml:space="preserve">Năng lực của nhóm trong Sprint là </w:t>
       </w:r>
       <w:r>
         <w:rPr>
           <w:rStyle w:val="7"/>
+          <w:rFonts w:hint="default" w:ascii="Times New Roman" w:hAnsi="Times New Roman" w:cs="Times New Roman"/>
+          <w:sz w:val="20"/>
+          <w:szCs w:val="20"/>
         </w:rPr>
         <w:t>10 điểm</w:t>
       </w:r>
       <w:r>
+        <w:rPr>
+          <w:rFonts w:hint="default" w:ascii="Times New Roman" w:hAnsi="Times New Roman" w:cs="Times New Roman"/>
+          <w:sz w:val="20"/>
+          <w:szCs w:val="20"/>
+        </w:rPr>
         <w:t>. Ưu tiên đưa các hạng mục Must vào Sprint trước, sau đó chọn thêm Should nếu còn đủ năng lực.</w:t>
       </w:r>
     </w:p>
     <w:tbl>
       <w:tblPr>
+        <w:tblStyle w:val="6"/>
         <w:tblW w:w="0" w:type="auto"/>
         <w:tblInd w:w="0" w:type="dxa"/>
         <w:tblBorders>
@@ -1632,7 +1981,7 @@
           <w:insideH w:val="single" w:color="auto" w:sz="4" w:space="0"/>
           <w:insideV w:val="single" w:color="auto" w:sz="4" w:space="0"/>
         </w:tblBorders>
-        <w:shd w:val="clear"/>
+        <w:shd w:val="clear" w:color="auto" w:fill="auto"/>
         <w:tblLayout w:type="autofit"/>
         <w:tblCellMar>
           <w:top w:w="14" w:type="dxa"/>
@@ -1642,10 +1991,10 @@
         </w:tblCellMar>
       </w:tblPr>
       <w:tblGrid>
-        <w:gridCol w:w="392"/>
-        <w:gridCol w:w="5774"/>
-        <w:gridCol w:w="578"/>
-        <w:gridCol w:w="749"/>
+        <w:gridCol w:w="408"/>
+        <w:gridCol w:w="3909"/>
+        <w:gridCol w:w="485"/>
+        <w:gridCol w:w="596"/>
       </w:tblGrid>
       <w:tr>
         <w:tblPrEx>
@@ -1657,7 +2006,7 @@
             <w:insideH w:val="single" w:color="auto" w:sz="4" w:space="0"/>
             <w:insideV w:val="single" w:color="auto" w:sz="4" w:space="0"/>
           </w:tblBorders>
-          <w:shd w:val="clear"/>
+          <w:shd w:val="clear" w:color="auto" w:fill="auto"/>
           <w:tblCellMar>
             <w:top w:w="14" w:type="dxa"/>
             <w:left w:w="15" w:type="dxa"/>
@@ -1668,7 +2017,7 @@
         <w:tc>
           <w:tcPr>
             <w:tcW w:w="0" w:type="auto"/>
-            <w:shd w:val="clear"/>
+            <w:shd w:val="clear" w:color="auto" w:fill="auto"/>
             <w:vAlign w:val="center"/>
           </w:tcPr>
           <w:p>
@@ -1679,18 +2028,21 @@
               <w:suppressLineNumbers w:val="0"/>
               <w:jc w:val="center"/>
               <w:rPr>
+                <w:rFonts w:hint="default" w:ascii="Times New Roman" w:hAnsi="Times New Roman" w:cs="Times New Roman"/>
                 <w:b/>
                 <w:bCs/>
-              </w:rPr>
-            </w:pPr>
-            <w:r>
-              <w:rPr>
-                <w:rFonts w:ascii="SimSun" w:hAnsi="SimSun" w:eastAsia="SimSun" w:cs="SimSun"/>
+                <w:sz w:val="20"/>
+                <w:szCs w:val="20"/>
+              </w:rPr>
+            </w:pPr>
+            <w:r>
+              <w:rPr>
+                <w:rFonts w:hint="default" w:ascii="Times New Roman" w:hAnsi="Times New Roman" w:eastAsia="SimSun" w:cs="Times New Roman"/>
                 <w:b/>
                 <w:bCs/>
                 <w:kern w:val="0"/>
-                <w:sz w:val="24"/>
-                <w:szCs w:val="24"/>
+                <w:sz w:val="20"/>
+                <w:szCs w:val="20"/>
                 <w:lang w:val="en-US" w:eastAsia="zh-CN" w:bidi="ar"/>
               </w:rPr>
               <w:t>STT</w:t>
@@ -1700,7 +2052,7 @@
         <w:tc>
           <w:tcPr>
             <w:tcW w:w="0" w:type="auto"/>
-            <w:shd w:val="clear"/>
+            <w:shd w:val="clear" w:color="auto" w:fill="auto"/>
             <w:vAlign w:val="center"/>
           </w:tcPr>
           <w:p>
@@ -1711,18 +2063,21 @@
               <w:suppressLineNumbers w:val="0"/>
               <w:jc w:val="center"/>
               <w:rPr>
+                <w:rFonts w:hint="default" w:ascii="Times New Roman" w:hAnsi="Times New Roman" w:cs="Times New Roman"/>
                 <w:b/>
                 <w:bCs/>
-              </w:rPr>
-            </w:pPr>
-            <w:r>
-              <w:rPr>
-                <w:rFonts w:ascii="SimSun" w:hAnsi="SimSun" w:eastAsia="SimSun" w:cs="SimSun"/>
+                <w:sz w:val="20"/>
+                <w:szCs w:val="20"/>
+              </w:rPr>
+            </w:pPr>
+            <w:r>
+              <w:rPr>
+                <w:rFonts w:hint="default" w:ascii="Times New Roman" w:hAnsi="Times New Roman" w:eastAsia="SimSun" w:cs="Times New Roman"/>
                 <w:b/>
                 <w:bCs/>
                 <w:kern w:val="0"/>
-                <w:sz w:val="24"/>
-                <w:szCs w:val="24"/>
+                <w:sz w:val="20"/>
+                <w:szCs w:val="20"/>
                 <w:lang w:val="en-US" w:eastAsia="zh-CN" w:bidi="ar"/>
               </w:rPr>
               <w:t>Hạng mục đưa vào Sprint</w:t>
@@ -1732,7 +2087,7 @@
         <w:tc>
           <w:tcPr>
             <w:tcW w:w="0" w:type="auto"/>
-            <w:shd w:val="clear"/>
+            <w:shd w:val="clear" w:color="auto" w:fill="auto"/>
             <w:vAlign w:val="center"/>
           </w:tcPr>
           <w:p>
@@ -1743,18 +2098,21 @@
               <w:suppressLineNumbers w:val="0"/>
               <w:jc w:val="center"/>
               <w:rPr>
+                <w:rFonts w:hint="default" w:ascii="Times New Roman" w:hAnsi="Times New Roman" w:cs="Times New Roman"/>
                 <w:b/>
                 <w:bCs/>
-              </w:rPr>
-            </w:pPr>
-            <w:r>
-              <w:rPr>
-                <w:rFonts w:ascii="SimSun" w:hAnsi="SimSun" w:eastAsia="SimSun" w:cs="SimSun"/>
+                <w:sz w:val="20"/>
+                <w:szCs w:val="20"/>
+              </w:rPr>
+            </w:pPr>
+            <w:r>
+              <w:rPr>
+                <w:rFonts w:hint="default" w:ascii="Times New Roman" w:hAnsi="Times New Roman" w:eastAsia="SimSun" w:cs="Times New Roman"/>
                 <w:b/>
                 <w:bCs/>
                 <w:kern w:val="0"/>
-                <w:sz w:val="24"/>
-                <w:szCs w:val="24"/>
+                <w:sz w:val="20"/>
+                <w:szCs w:val="20"/>
                 <w:lang w:val="en-US" w:eastAsia="zh-CN" w:bidi="ar"/>
               </w:rPr>
               <w:t>Điểm</w:t>
@@ -1764,7 +2122,7 @@
         <w:tc>
           <w:tcPr>
             <w:tcW w:w="0" w:type="auto"/>
-            <w:shd w:val="clear"/>
+            <w:shd w:val="clear" w:color="auto" w:fill="auto"/>
             <w:vAlign w:val="center"/>
           </w:tcPr>
           <w:p>
@@ -1775,18 +2133,21 @@
               <w:suppressLineNumbers w:val="0"/>
               <w:jc w:val="center"/>
               <w:rPr>
+                <w:rFonts w:hint="default" w:ascii="Times New Roman" w:hAnsi="Times New Roman" w:cs="Times New Roman"/>
                 <w:b/>
                 <w:bCs/>
-              </w:rPr>
-            </w:pPr>
-            <w:r>
-              <w:rPr>
-                <w:rFonts w:ascii="SimSun" w:hAnsi="SimSun" w:eastAsia="SimSun" w:cs="SimSun"/>
+                <w:sz w:val="20"/>
+                <w:szCs w:val="20"/>
+              </w:rPr>
+            </w:pPr>
+            <w:r>
+              <w:rPr>
+                <w:rFonts w:hint="default" w:ascii="Times New Roman" w:hAnsi="Times New Roman" w:eastAsia="SimSun" w:cs="Times New Roman"/>
                 <w:b/>
                 <w:bCs/>
                 <w:kern w:val="0"/>
-                <w:sz w:val="24"/>
-                <w:szCs w:val="24"/>
+                <w:sz w:val="20"/>
+                <w:szCs w:val="20"/>
                 <w:lang w:val="en-US" w:eastAsia="zh-CN" w:bidi="ar"/>
               </w:rPr>
               <w:t>Nhãn</w:t>
@@ -1804,7 +2165,7 @@
             <w:insideH w:val="single" w:color="auto" w:sz="4" w:space="0"/>
             <w:insideV w:val="single" w:color="auto" w:sz="4" w:space="0"/>
           </w:tblBorders>
-          <w:shd w:val="clear"/>
+          <w:shd w:val="clear" w:color="auto" w:fill="auto"/>
           <w:tblCellMar>
             <w:top w:w="14" w:type="dxa"/>
             <w:left w:w="15" w:type="dxa"/>
@@ -1815,23 +2176,28 @@
         <w:tc>
           <w:tcPr>
             <w:tcW w:w="0" w:type="auto"/>
-            <w:shd w:val="clear"/>
-            <w:vAlign w:val="center"/>
-          </w:tcPr>
-          <w:p>
-            <w:pPr>
-              <w:keepNext w:val="0"/>
-              <w:keepLines w:val="0"/>
-              <w:widowControl/>
-              <w:suppressLineNumbers w:val="0"/>
-              <w:jc w:val="left"/>
-            </w:pPr>
-            <w:r>
-              <w:rPr>
-                <w:rFonts w:ascii="SimSun" w:hAnsi="SimSun" w:eastAsia="SimSun" w:cs="SimSun"/>
-                <w:kern w:val="0"/>
-                <w:sz w:val="24"/>
-                <w:szCs w:val="24"/>
+            <w:shd w:val="clear" w:color="auto" w:fill="auto"/>
+            <w:vAlign w:val="center"/>
+          </w:tcPr>
+          <w:p>
+            <w:pPr>
+              <w:keepNext w:val="0"/>
+              <w:keepLines w:val="0"/>
+              <w:widowControl/>
+              <w:suppressLineNumbers w:val="0"/>
+              <w:jc w:val="left"/>
+              <w:rPr>
+                <w:rFonts w:hint="default" w:ascii="Times New Roman" w:hAnsi="Times New Roman" w:cs="Times New Roman"/>
+                <w:sz w:val="20"/>
+                <w:szCs w:val="20"/>
+              </w:rPr>
+            </w:pPr>
+            <w:r>
+              <w:rPr>
+                <w:rFonts w:hint="default" w:ascii="Times New Roman" w:hAnsi="Times New Roman" w:eastAsia="SimSun" w:cs="Times New Roman"/>
+                <w:kern w:val="0"/>
+                <w:sz w:val="20"/>
+                <w:szCs w:val="20"/>
                 <w:lang w:val="en-US" w:eastAsia="zh-CN" w:bidi="ar"/>
               </w:rPr>
               <w:t>1</w:t>
@@ -1841,23 +2207,28 @@
         <w:tc>
           <w:tcPr>
             <w:tcW w:w="0" w:type="auto"/>
-            <w:shd w:val="clear"/>
-            <w:vAlign w:val="center"/>
-          </w:tcPr>
-          <w:p>
-            <w:pPr>
-              <w:keepNext w:val="0"/>
-              <w:keepLines w:val="0"/>
-              <w:widowControl/>
-              <w:suppressLineNumbers w:val="0"/>
-              <w:jc w:val="left"/>
-            </w:pPr>
-            <w:r>
-              <w:rPr>
-                <w:rFonts w:ascii="SimSun" w:hAnsi="SimSun" w:eastAsia="SimSun" w:cs="SimSun"/>
-                <w:kern w:val="0"/>
-                <w:sz w:val="24"/>
-                <w:szCs w:val="24"/>
+            <w:shd w:val="clear" w:color="auto" w:fill="auto"/>
+            <w:vAlign w:val="center"/>
+          </w:tcPr>
+          <w:p>
+            <w:pPr>
+              <w:keepNext w:val="0"/>
+              <w:keepLines w:val="0"/>
+              <w:widowControl/>
+              <w:suppressLineNumbers w:val="0"/>
+              <w:jc w:val="left"/>
+              <w:rPr>
+                <w:rFonts w:hint="default" w:ascii="Times New Roman" w:hAnsi="Times New Roman" w:cs="Times New Roman"/>
+                <w:sz w:val="20"/>
+                <w:szCs w:val="20"/>
+              </w:rPr>
+            </w:pPr>
+            <w:r>
+              <w:rPr>
+                <w:rFonts w:hint="default" w:ascii="Times New Roman" w:hAnsi="Times New Roman" w:eastAsia="SimSun" w:cs="Times New Roman"/>
+                <w:kern w:val="0"/>
+                <w:sz w:val="20"/>
+                <w:szCs w:val="20"/>
                 <w:lang w:val="en-US" w:eastAsia="zh-CN" w:bidi="ar"/>
               </w:rPr>
               <w:t>Sửa lỗi hiển thị sai cước sau khuyến mãi</w:t>
@@ -1867,23 +2238,28 @@
         <w:tc>
           <w:tcPr>
             <w:tcW w:w="0" w:type="auto"/>
-            <w:shd w:val="clear"/>
-            <w:vAlign w:val="center"/>
-          </w:tcPr>
-          <w:p>
-            <w:pPr>
-              <w:keepNext w:val="0"/>
-              <w:keepLines w:val="0"/>
-              <w:widowControl/>
-              <w:suppressLineNumbers w:val="0"/>
-              <w:jc w:val="left"/>
-            </w:pPr>
-            <w:r>
-              <w:rPr>
-                <w:rFonts w:ascii="SimSun" w:hAnsi="SimSun" w:eastAsia="SimSun" w:cs="SimSun"/>
-                <w:kern w:val="0"/>
-                <w:sz w:val="24"/>
-                <w:szCs w:val="24"/>
+            <w:shd w:val="clear" w:color="auto" w:fill="auto"/>
+            <w:vAlign w:val="center"/>
+          </w:tcPr>
+          <w:p>
+            <w:pPr>
+              <w:keepNext w:val="0"/>
+              <w:keepLines w:val="0"/>
+              <w:widowControl/>
+              <w:suppressLineNumbers w:val="0"/>
+              <w:jc w:val="left"/>
+              <w:rPr>
+                <w:rFonts w:hint="default" w:ascii="Times New Roman" w:hAnsi="Times New Roman" w:cs="Times New Roman"/>
+                <w:sz w:val="20"/>
+                <w:szCs w:val="20"/>
+              </w:rPr>
+            </w:pPr>
+            <w:r>
+              <w:rPr>
+                <w:rFonts w:hint="default" w:ascii="Times New Roman" w:hAnsi="Times New Roman" w:eastAsia="SimSun" w:cs="Times New Roman"/>
+                <w:kern w:val="0"/>
+                <w:sz w:val="20"/>
+                <w:szCs w:val="20"/>
                 <w:lang w:val="en-US" w:eastAsia="zh-CN" w:bidi="ar"/>
               </w:rPr>
               <w:t>2</w:t>
@@ -1893,23 +2269,28 @@
         <w:tc>
           <w:tcPr>
             <w:tcW w:w="0" w:type="auto"/>
-            <w:shd w:val="clear"/>
-            <w:vAlign w:val="center"/>
-          </w:tcPr>
-          <w:p>
-            <w:pPr>
-              <w:keepNext w:val="0"/>
-              <w:keepLines w:val="0"/>
-              <w:widowControl/>
-              <w:suppressLineNumbers w:val="0"/>
-              <w:jc w:val="left"/>
-            </w:pPr>
-            <w:r>
-              <w:rPr>
-                <w:rFonts w:ascii="SimSun" w:hAnsi="SimSun" w:eastAsia="SimSun" w:cs="SimSun"/>
-                <w:kern w:val="0"/>
-                <w:sz w:val="24"/>
-                <w:szCs w:val="24"/>
+            <w:shd w:val="clear" w:color="auto" w:fill="auto"/>
+            <w:vAlign w:val="center"/>
+          </w:tcPr>
+          <w:p>
+            <w:pPr>
+              <w:keepNext w:val="0"/>
+              <w:keepLines w:val="0"/>
+              <w:widowControl/>
+              <w:suppressLineNumbers w:val="0"/>
+              <w:jc w:val="left"/>
+              <w:rPr>
+                <w:rFonts w:hint="default" w:ascii="Times New Roman" w:hAnsi="Times New Roman" w:cs="Times New Roman"/>
+                <w:sz w:val="20"/>
+                <w:szCs w:val="20"/>
+              </w:rPr>
+            </w:pPr>
+            <w:r>
+              <w:rPr>
+                <w:rFonts w:hint="default" w:ascii="Times New Roman" w:hAnsi="Times New Roman" w:eastAsia="SimSun" w:cs="Times New Roman"/>
+                <w:kern w:val="0"/>
+                <w:sz w:val="20"/>
+                <w:szCs w:val="20"/>
                 <w:lang w:val="en-US" w:eastAsia="zh-CN" w:bidi="ar"/>
               </w:rPr>
               <w:t>Must</w:t>
@@ -1927,7 +2308,7 @@
             <w:insideH w:val="single" w:color="auto" w:sz="4" w:space="0"/>
             <w:insideV w:val="single" w:color="auto" w:sz="4" w:space="0"/>
           </w:tblBorders>
-          <w:shd w:val="clear"/>
+          <w:shd w:val="clear" w:color="auto" w:fill="auto"/>
           <w:tblCellMar>
             <w:top w:w="14" w:type="dxa"/>
             <w:left w:w="15" w:type="dxa"/>
@@ -1938,23 +2319,28 @@
         <w:tc>
           <w:tcPr>
             <w:tcW w:w="0" w:type="auto"/>
-            <w:shd w:val="clear"/>
-            <w:vAlign w:val="center"/>
-          </w:tcPr>
-          <w:p>
-            <w:pPr>
-              <w:keepNext w:val="0"/>
-              <w:keepLines w:val="0"/>
-              <w:widowControl/>
-              <w:suppressLineNumbers w:val="0"/>
-              <w:jc w:val="left"/>
-            </w:pPr>
-            <w:r>
-              <w:rPr>
-                <w:rFonts w:ascii="SimSun" w:hAnsi="SimSun" w:eastAsia="SimSun" w:cs="SimSun"/>
-                <w:kern w:val="0"/>
-                <w:sz w:val="24"/>
-                <w:szCs w:val="24"/>
+            <w:shd w:val="clear" w:color="auto" w:fill="auto"/>
+            <w:vAlign w:val="center"/>
+          </w:tcPr>
+          <w:p>
+            <w:pPr>
+              <w:keepNext w:val="0"/>
+              <w:keepLines w:val="0"/>
+              <w:widowControl/>
+              <w:suppressLineNumbers w:val="0"/>
+              <w:jc w:val="left"/>
+              <w:rPr>
+                <w:rFonts w:hint="default" w:ascii="Times New Roman" w:hAnsi="Times New Roman" w:cs="Times New Roman"/>
+                <w:sz w:val="20"/>
+                <w:szCs w:val="20"/>
+              </w:rPr>
+            </w:pPr>
+            <w:r>
+              <w:rPr>
+                <w:rFonts w:hint="default" w:ascii="Times New Roman" w:hAnsi="Times New Roman" w:eastAsia="SimSun" w:cs="Times New Roman"/>
+                <w:kern w:val="0"/>
+                <w:sz w:val="20"/>
+                <w:szCs w:val="20"/>
                 <w:lang w:val="en-US" w:eastAsia="zh-CN" w:bidi="ar"/>
               </w:rPr>
               <w:t>2</w:t>
@@ -1964,23 +2350,28 @@
         <w:tc>
           <w:tcPr>
             <w:tcW w:w="0" w:type="auto"/>
-            <w:shd w:val="clear"/>
-            <w:vAlign w:val="center"/>
-          </w:tcPr>
-          <w:p>
-            <w:pPr>
-              <w:keepNext w:val="0"/>
-              <w:keepLines w:val="0"/>
-              <w:widowControl/>
-              <w:suppressLineNumbers w:val="0"/>
-              <w:jc w:val="left"/>
-            </w:pPr>
-            <w:r>
-              <w:rPr>
-                <w:rFonts w:ascii="SimSun" w:hAnsi="SimSun" w:eastAsia="SimSun" w:cs="SimSun"/>
-                <w:kern w:val="0"/>
-                <w:sz w:val="24"/>
-                <w:szCs w:val="24"/>
+            <w:shd w:val="clear" w:color="auto" w:fill="auto"/>
+            <w:vAlign w:val="center"/>
+          </w:tcPr>
+          <w:p>
+            <w:pPr>
+              <w:keepNext w:val="0"/>
+              <w:keepLines w:val="0"/>
+              <w:widowControl/>
+              <w:suppressLineNumbers w:val="0"/>
+              <w:jc w:val="left"/>
+              <w:rPr>
+                <w:rFonts w:hint="default" w:ascii="Times New Roman" w:hAnsi="Times New Roman" w:cs="Times New Roman"/>
+                <w:sz w:val="20"/>
+                <w:szCs w:val="20"/>
+              </w:rPr>
+            </w:pPr>
+            <w:r>
+              <w:rPr>
+                <w:rFonts w:hint="default" w:ascii="Times New Roman" w:hAnsi="Times New Roman" w:eastAsia="SimSun" w:cs="Times New Roman"/>
+                <w:kern w:val="0"/>
+                <w:sz w:val="20"/>
+                <w:szCs w:val="20"/>
                 <w:lang w:val="en-US" w:eastAsia="zh-CN" w:bidi="ar"/>
               </w:rPr>
               <w:t>Áp mã khuyến mãi khi đặt xe</w:t>
@@ -1990,23 +2381,28 @@
         <w:tc>
           <w:tcPr>
             <w:tcW w:w="0" w:type="auto"/>
-            <w:shd w:val="clear"/>
-            <w:vAlign w:val="center"/>
-          </w:tcPr>
-          <w:p>
-            <w:pPr>
-              <w:keepNext w:val="0"/>
-              <w:keepLines w:val="0"/>
-              <w:widowControl/>
-              <w:suppressLineNumbers w:val="0"/>
-              <w:jc w:val="left"/>
-            </w:pPr>
-            <w:r>
-              <w:rPr>
-                <w:rFonts w:ascii="SimSun" w:hAnsi="SimSun" w:eastAsia="SimSun" w:cs="SimSun"/>
-                <w:kern w:val="0"/>
-                <w:sz w:val="24"/>
-                <w:szCs w:val="24"/>
+            <w:shd w:val="clear" w:color="auto" w:fill="auto"/>
+            <w:vAlign w:val="center"/>
+          </w:tcPr>
+          <w:p>
+            <w:pPr>
+              <w:keepNext w:val="0"/>
+              <w:keepLines w:val="0"/>
+              <w:widowControl/>
+              <w:suppressLineNumbers w:val="0"/>
+              <w:jc w:val="left"/>
+              <w:rPr>
+                <w:rFonts w:hint="default" w:ascii="Times New Roman" w:hAnsi="Times New Roman" w:cs="Times New Roman"/>
+                <w:sz w:val="20"/>
+                <w:szCs w:val="20"/>
+              </w:rPr>
+            </w:pPr>
+            <w:r>
+              <w:rPr>
+                <w:rFonts w:hint="default" w:ascii="Times New Roman" w:hAnsi="Times New Roman" w:eastAsia="SimSun" w:cs="Times New Roman"/>
+                <w:kern w:val="0"/>
+                <w:sz w:val="20"/>
+                <w:szCs w:val="20"/>
                 <w:lang w:val="en-US" w:eastAsia="zh-CN" w:bidi="ar"/>
               </w:rPr>
               <w:t>2</w:t>
@@ -2016,23 +2412,28 @@
         <w:tc>
           <w:tcPr>
             <w:tcW w:w="0" w:type="auto"/>
-            <w:shd w:val="clear"/>
-            <w:vAlign w:val="center"/>
-          </w:tcPr>
-          <w:p>
-            <w:pPr>
-              <w:keepNext w:val="0"/>
-              <w:keepLines w:val="0"/>
-              <w:widowControl/>
-              <w:suppressLineNumbers w:val="0"/>
-              <w:jc w:val="left"/>
-            </w:pPr>
-            <w:r>
-              <w:rPr>
-                <w:rFonts w:ascii="SimSun" w:hAnsi="SimSun" w:eastAsia="SimSun" w:cs="SimSun"/>
-                <w:kern w:val="0"/>
-                <w:sz w:val="24"/>
-                <w:szCs w:val="24"/>
+            <w:shd w:val="clear" w:color="auto" w:fill="auto"/>
+            <w:vAlign w:val="center"/>
+          </w:tcPr>
+          <w:p>
+            <w:pPr>
+              <w:keepNext w:val="0"/>
+              <w:keepLines w:val="0"/>
+              <w:widowControl/>
+              <w:suppressLineNumbers w:val="0"/>
+              <w:jc w:val="left"/>
+              <w:rPr>
+                <w:rFonts w:hint="default" w:ascii="Times New Roman" w:hAnsi="Times New Roman" w:cs="Times New Roman"/>
+                <w:sz w:val="20"/>
+                <w:szCs w:val="20"/>
+              </w:rPr>
+            </w:pPr>
+            <w:r>
+              <w:rPr>
+                <w:rFonts w:hint="default" w:ascii="Times New Roman" w:hAnsi="Times New Roman" w:eastAsia="SimSun" w:cs="Times New Roman"/>
+                <w:kern w:val="0"/>
+                <w:sz w:val="20"/>
+                <w:szCs w:val="20"/>
                 <w:lang w:val="en-US" w:eastAsia="zh-CN" w:bidi="ar"/>
               </w:rPr>
               <w:t>Must</w:t>
@@ -2050,7 +2451,7 @@
             <w:insideH w:val="single" w:color="auto" w:sz="4" w:space="0"/>
             <w:insideV w:val="single" w:color="auto" w:sz="4" w:space="0"/>
           </w:tblBorders>
-          <w:shd w:val="clear"/>
+          <w:shd w:val="clear" w:color="auto" w:fill="auto"/>
           <w:tblCellMar>
             <w:top w:w="14" w:type="dxa"/>
             <w:left w:w="15" w:type="dxa"/>
@@ -2061,23 +2462,28 @@
         <w:tc>
           <w:tcPr>
             <w:tcW w:w="0" w:type="auto"/>
-            <w:shd w:val="clear"/>
-            <w:vAlign w:val="center"/>
-          </w:tcPr>
-          <w:p>
-            <w:pPr>
-              <w:keepNext w:val="0"/>
-              <w:keepLines w:val="0"/>
-              <w:widowControl/>
-              <w:suppressLineNumbers w:val="0"/>
-              <w:jc w:val="left"/>
-            </w:pPr>
-            <w:r>
-              <w:rPr>
-                <w:rFonts w:ascii="SimSun" w:hAnsi="SimSun" w:eastAsia="SimSun" w:cs="SimSun"/>
-                <w:kern w:val="0"/>
-                <w:sz w:val="24"/>
-                <w:szCs w:val="24"/>
+            <w:shd w:val="clear" w:color="auto" w:fill="auto"/>
+            <w:vAlign w:val="center"/>
+          </w:tcPr>
+          <w:p>
+            <w:pPr>
+              <w:keepNext w:val="0"/>
+              <w:keepLines w:val="0"/>
+              <w:widowControl/>
+              <w:suppressLineNumbers w:val="0"/>
+              <w:jc w:val="left"/>
+              <w:rPr>
+                <w:rFonts w:hint="default" w:ascii="Times New Roman" w:hAnsi="Times New Roman" w:cs="Times New Roman"/>
+                <w:sz w:val="20"/>
+                <w:szCs w:val="20"/>
+              </w:rPr>
+            </w:pPr>
+            <w:r>
+              <w:rPr>
+                <w:rFonts w:hint="default" w:ascii="Times New Roman" w:hAnsi="Times New Roman" w:eastAsia="SimSun" w:cs="Times New Roman"/>
+                <w:kern w:val="0"/>
+                <w:sz w:val="20"/>
+                <w:szCs w:val="20"/>
                 <w:lang w:val="en-US" w:eastAsia="zh-CN" w:bidi="ar"/>
               </w:rPr>
               <w:t>3</w:t>
@@ -2087,23 +2493,28 @@
         <w:tc>
           <w:tcPr>
             <w:tcW w:w="0" w:type="auto"/>
-            <w:shd w:val="clear"/>
-            <w:vAlign w:val="center"/>
-          </w:tcPr>
-          <w:p>
-            <w:pPr>
-              <w:keepNext w:val="0"/>
-              <w:keepLines w:val="0"/>
-              <w:widowControl/>
-              <w:suppressLineNumbers w:val="0"/>
-              <w:jc w:val="left"/>
-            </w:pPr>
-            <w:r>
-              <w:rPr>
-                <w:rFonts w:ascii="SimSun" w:hAnsi="SimSun" w:eastAsia="SimSun" w:cs="SimSun"/>
-                <w:kern w:val="0"/>
-                <w:sz w:val="24"/>
-                <w:szCs w:val="24"/>
+            <w:shd w:val="clear" w:color="auto" w:fill="auto"/>
+            <w:vAlign w:val="center"/>
+          </w:tcPr>
+          <w:p>
+            <w:pPr>
+              <w:keepNext w:val="0"/>
+              <w:keepLines w:val="0"/>
+              <w:widowControl/>
+              <w:suppressLineNumbers w:val="0"/>
+              <w:jc w:val="left"/>
+              <w:rPr>
+                <w:rFonts w:hint="default" w:ascii="Times New Roman" w:hAnsi="Times New Roman" w:cs="Times New Roman"/>
+                <w:sz w:val="20"/>
+                <w:szCs w:val="20"/>
+              </w:rPr>
+            </w:pPr>
+            <w:r>
+              <w:rPr>
+                <w:rFonts w:hint="default" w:ascii="Times New Roman" w:hAnsi="Times New Roman" w:eastAsia="SimSun" w:cs="Times New Roman"/>
+                <w:kern w:val="0"/>
+                <w:sz w:val="20"/>
+                <w:szCs w:val="20"/>
                 <w:lang w:val="en-US" w:eastAsia="zh-CN" w:bidi="ar"/>
               </w:rPr>
               <w:t>Thanh toán bằng ví RikkeiPay</w:t>
@@ -2113,23 +2524,28 @@
         <w:tc>
           <w:tcPr>
             <w:tcW w:w="0" w:type="auto"/>
-            <w:shd w:val="clear"/>
-            <w:vAlign w:val="center"/>
-          </w:tcPr>
-          <w:p>
-            <w:pPr>
-              <w:keepNext w:val="0"/>
-              <w:keepLines w:val="0"/>
-              <w:widowControl/>
-              <w:suppressLineNumbers w:val="0"/>
-              <w:jc w:val="left"/>
-            </w:pPr>
-            <w:r>
-              <w:rPr>
-                <w:rFonts w:ascii="SimSun" w:hAnsi="SimSun" w:eastAsia="SimSun" w:cs="SimSun"/>
-                <w:kern w:val="0"/>
-                <w:sz w:val="24"/>
-                <w:szCs w:val="24"/>
+            <w:shd w:val="clear" w:color="auto" w:fill="auto"/>
+            <w:vAlign w:val="center"/>
+          </w:tcPr>
+          <w:p>
+            <w:pPr>
+              <w:keepNext w:val="0"/>
+              <w:keepLines w:val="0"/>
+              <w:widowControl/>
+              <w:suppressLineNumbers w:val="0"/>
+              <w:jc w:val="left"/>
+              <w:rPr>
+                <w:rFonts w:hint="default" w:ascii="Times New Roman" w:hAnsi="Times New Roman" w:cs="Times New Roman"/>
+                <w:sz w:val="20"/>
+                <w:szCs w:val="20"/>
+              </w:rPr>
+            </w:pPr>
+            <w:r>
+              <w:rPr>
+                <w:rFonts w:hint="default" w:ascii="Times New Roman" w:hAnsi="Times New Roman" w:eastAsia="SimSun" w:cs="Times New Roman"/>
+                <w:kern w:val="0"/>
+                <w:sz w:val="20"/>
+                <w:szCs w:val="20"/>
                 <w:lang w:val="en-US" w:eastAsia="zh-CN" w:bidi="ar"/>
               </w:rPr>
               <w:t>3</w:t>
@@ -2139,23 +2555,28 @@
         <w:tc>
           <w:tcPr>
             <w:tcW w:w="0" w:type="auto"/>
-            <w:shd w:val="clear"/>
-            <w:vAlign w:val="center"/>
-          </w:tcPr>
-          <w:p>
-            <w:pPr>
-              <w:keepNext w:val="0"/>
-              <w:keepLines w:val="0"/>
-              <w:widowControl/>
-              <w:suppressLineNumbers w:val="0"/>
-              <w:jc w:val="left"/>
-            </w:pPr>
-            <w:r>
-              <w:rPr>
-                <w:rFonts w:ascii="SimSun" w:hAnsi="SimSun" w:eastAsia="SimSun" w:cs="SimSun"/>
-                <w:kern w:val="0"/>
-                <w:sz w:val="24"/>
-                <w:szCs w:val="24"/>
+            <w:shd w:val="clear" w:color="auto" w:fill="auto"/>
+            <w:vAlign w:val="center"/>
+          </w:tcPr>
+          <w:p>
+            <w:pPr>
+              <w:keepNext w:val="0"/>
+              <w:keepLines w:val="0"/>
+              <w:widowControl/>
+              <w:suppressLineNumbers w:val="0"/>
+              <w:jc w:val="left"/>
+              <w:rPr>
+                <w:rFonts w:hint="default" w:ascii="Times New Roman" w:hAnsi="Times New Roman" w:cs="Times New Roman"/>
+                <w:sz w:val="20"/>
+                <w:szCs w:val="20"/>
+              </w:rPr>
+            </w:pPr>
+            <w:r>
+              <w:rPr>
+                <w:rFonts w:hint="default" w:ascii="Times New Roman" w:hAnsi="Times New Roman" w:eastAsia="SimSun" w:cs="Times New Roman"/>
+                <w:kern w:val="0"/>
+                <w:sz w:val="20"/>
+                <w:szCs w:val="20"/>
                 <w:lang w:val="en-US" w:eastAsia="zh-CN" w:bidi="ar"/>
               </w:rPr>
               <w:t>Should</w:t>
@@ -2173,7 +2594,7 @@
             <w:insideH w:val="single" w:color="auto" w:sz="4" w:space="0"/>
             <w:insideV w:val="single" w:color="auto" w:sz="4" w:space="0"/>
           </w:tblBorders>
-          <w:shd w:val="clear"/>
+          <w:shd w:val="clear" w:color="auto" w:fill="auto"/>
           <w:tblCellMar>
             <w:top w:w="14" w:type="dxa"/>
             <w:left w:w="15" w:type="dxa"/>
@@ -2184,23 +2605,28 @@
         <w:tc>
           <w:tcPr>
             <w:tcW w:w="0" w:type="auto"/>
-            <w:shd w:val="clear"/>
-            <w:vAlign w:val="center"/>
-          </w:tcPr>
-          <w:p>
-            <w:pPr>
-              <w:keepNext w:val="0"/>
-              <w:keepLines w:val="0"/>
-              <w:widowControl/>
-              <w:suppressLineNumbers w:val="0"/>
-              <w:jc w:val="left"/>
-            </w:pPr>
-            <w:r>
-              <w:rPr>
-                <w:rFonts w:ascii="SimSun" w:hAnsi="SimSun" w:eastAsia="SimSun" w:cs="SimSun"/>
-                <w:kern w:val="0"/>
-                <w:sz w:val="24"/>
-                <w:szCs w:val="24"/>
+            <w:shd w:val="clear" w:color="auto" w:fill="auto"/>
+            <w:vAlign w:val="center"/>
+          </w:tcPr>
+          <w:p>
+            <w:pPr>
+              <w:keepNext w:val="0"/>
+              <w:keepLines w:val="0"/>
+              <w:widowControl/>
+              <w:suppressLineNumbers w:val="0"/>
+              <w:jc w:val="left"/>
+              <w:rPr>
+                <w:rFonts w:hint="default" w:ascii="Times New Roman" w:hAnsi="Times New Roman" w:cs="Times New Roman"/>
+                <w:sz w:val="20"/>
+                <w:szCs w:val="20"/>
+              </w:rPr>
+            </w:pPr>
+            <w:r>
+              <w:rPr>
+                <w:rFonts w:hint="default" w:ascii="Times New Roman" w:hAnsi="Times New Roman" w:eastAsia="SimSun" w:cs="Times New Roman"/>
+                <w:kern w:val="0"/>
+                <w:sz w:val="20"/>
+                <w:szCs w:val="20"/>
                 <w:lang w:val="en-US" w:eastAsia="zh-CN" w:bidi="ar"/>
               </w:rPr>
               <w:t>4</w:t>
@@ -2210,23 +2636,28 @@
         <w:tc>
           <w:tcPr>
             <w:tcW w:w="0" w:type="auto"/>
-            <w:shd w:val="clear"/>
-            <w:vAlign w:val="center"/>
-          </w:tcPr>
-          <w:p>
-            <w:pPr>
-              <w:keepNext w:val="0"/>
-              <w:keepLines w:val="0"/>
-              <w:widowControl/>
-              <w:suppressLineNumbers w:val="0"/>
-              <w:jc w:val="left"/>
-            </w:pPr>
-            <w:r>
-              <w:rPr>
-                <w:rFonts w:ascii="SimSun" w:hAnsi="SimSun" w:eastAsia="SimSun" w:cs="SimSun"/>
-                <w:kern w:val="0"/>
-                <w:sz w:val="24"/>
-                <w:szCs w:val="24"/>
+            <w:shd w:val="clear" w:color="auto" w:fill="auto"/>
+            <w:vAlign w:val="center"/>
+          </w:tcPr>
+          <w:p>
+            <w:pPr>
+              <w:keepNext w:val="0"/>
+              <w:keepLines w:val="0"/>
+              <w:widowControl/>
+              <w:suppressLineNumbers w:val="0"/>
+              <w:jc w:val="left"/>
+              <w:rPr>
+                <w:rFonts w:hint="default" w:ascii="Times New Roman" w:hAnsi="Times New Roman" w:cs="Times New Roman"/>
+                <w:sz w:val="20"/>
+                <w:szCs w:val="20"/>
+              </w:rPr>
+            </w:pPr>
+            <w:r>
+              <w:rPr>
+                <w:rFonts w:hint="default" w:ascii="Times New Roman" w:hAnsi="Times New Roman" w:eastAsia="SimSun" w:cs="Times New Roman"/>
+                <w:kern w:val="0"/>
+                <w:sz w:val="20"/>
+                <w:szCs w:val="20"/>
                 <w:lang w:val="en-US" w:eastAsia="zh-CN" w:bidi="ar"/>
               </w:rPr>
               <w:t>Giao diện trang trí cho chương trình khuyến mãi</w:t>
@@ -2236,23 +2667,28 @@
         <w:tc>
           <w:tcPr>
             <w:tcW w:w="0" w:type="auto"/>
-            <w:shd w:val="clear"/>
-            <w:vAlign w:val="center"/>
-          </w:tcPr>
-          <w:p>
-            <w:pPr>
-              <w:keepNext w:val="0"/>
-              <w:keepLines w:val="0"/>
-              <w:widowControl/>
-              <w:suppressLineNumbers w:val="0"/>
-              <w:jc w:val="left"/>
-            </w:pPr>
-            <w:r>
-              <w:rPr>
-                <w:rFonts w:ascii="SimSun" w:hAnsi="SimSun" w:eastAsia="SimSun" w:cs="SimSun"/>
-                <w:kern w:val="0"/>
-                <w:sz w:val="24"/>
-                <w:szCs w:val="24"/>
+            <w:shd w:val="clear" w:color="auto" w:fill="auto"/>
+            <w:vAlign w:val="center"/>
+          </w:tcPr>
+          <w:p>
+            <w:pPr>
+              <w:keepNext w:val="0"/>
+              <w:keepLines w:val="0"/>
+              <w:widowControl/>
+              <w:suppressLineNumbers w:val="0"/>
+              <w:jc w:val="left"/>
+              <w:rPr>
+                <w:rFonts w:hint="default" w:ascii="Times New Roman" w:hAnsi="Times New Roman" w:cs="Times New Roman"/>
+                <w:sz w:val="20"/>
+                <w:szCs w:val="20"/>
+              </w:rPr>
+            </w:pPr>
+            <w:r>
+              <w:rPr>
+                <w:rFonts w:hint="default" w:ascii="Times New Roman" w:hAnsi="Times New Roman" w:eastAsia="SimSun" w:cs="Times New Roman"/>
+                <w:kern w:val="0"/>
+                <w:sz w:val="20"/>
+                <w:szCs w:val="20"/>
                 <w:lang w:val="en-US" w:eastAsia="zh-CN" w:bidi="ar"/>
               </w:rPr>
               <w:t>2</w:t>
@@ -2262,23 +2698,28 @@
         <w:tc>
           <w:tcPr>
             <w:tcW w:w="0" w:type="auto"/>
-            <w:shd w:val="clear"/>
-            <w:vAlign w:val="center"/>
-          </w:tcPr>
-          <w:p>
-            <w:pPr>
-              <w:keepNext w:val="0"/>
-              <w:keepLines w:val="0"/>
-              <w:widowControl/>
-              <w:suppressLineNumbers w:val="0"/>
-              <w:jc w:val="left"/>
-            </w:pPr>
-            <w:r>
-              <w:rPr>
-                <w:rFonts w:ascii="SimSun" w:hAnsi="SimSun" w:eastAsia="SimSun" w:cs="SimSun"/>
-                <w:kern w:val="0"/>
-                <w:sz w:val="24"/>
-                <w:szCs w:val="24"/>
+            <w:shd w:val="clear" w:color="auto" w:fill="auto"/>
+            <w:vAlign w:val="center"/>
+          </w:tcPr>
+          <w:p>
+            <w:pPr>
+              <w:keepNext w:val="0"/>
+              <w:keepLines w:val="0"/>
+              <w:widowControl/>
+              <w:suppressLineNumbers w:val="0"/>
+              <w:jc w:val="left"/>
+              <w:rPr>
+                <w:rFonts w:hint="default" w:ascii="Times New Roman" w:hAnsi="Times New Roman" w:cs="Times New Roman"/>
+                <w:sz w:val="20"/>
+                <w:szCs w:val="20"/>
+              </w:rPr>
+            </w:pPr>
+            <w:r>
+              <w:rPr>
+                <w:rFonts w:hint="default" w:ascii="Times New Roman" w:hAnsi="Times New Roman" w:eastAsia="SimSun" w:cs="Times New Roman"/>
+                <w:kern w:val="0"/>
+                <w:sz w:val="20"/>
+                <w:szCs w:val="20"/>
                 <w:lang w:val="en-US" w:eastAsia="zh-CN" w:bidi="ar"/>
               </w:rPr>
               <w:t>Should</w:t>
@@ -2296,7 +2737,7 @@
             <w:insideH w:val="single" w:color="auto" w:sz="4" w:space="0"/>
             <w:insideV w:val="single" w:color="auto" w:sz="4" w:space="0"/>
           </w:tblBorders>
-          <w:shd w:val="clear"/>
+          <w:shd w:val="clear" w:color="auto" w:fill="auto"/>
           <w:tblCellMar>
             <w:top w:w="14" w:type="dxa"/>
             <w:left w:w="15" w:type="dxa"/>
@@ -2307,67 +2748,84 @@
         <w:tc>
           <w:tcPr>
             <w:tcW w:w="0" w:type="auto"/>
-            <w:shd w:val="clear"/>
-            <w:vAlign w:val="center"/>
-          </w:tcPr>
-          <w:p>
-            <w:pPr>
-              <w:keepNext w:val="0"/>
-              <w:keepLines w:val="0"/>
-              <w:widowControl/>
-              <w:suppressLineNumbers w:val="0"/>
-              <w:jc w:val="left"/>
-            </w:pPr>
-          </w:p>
-        </w:tc>
-        <w:tc>
-          <w:tcPr>
-            <w:tcW w:w="0" w:type="auto"/>
-            <w:shd w:val="clear"/>
-            <w:vAlign w:val="center"/>
-          </w:tcPr>
-          <w:p>
-            <w:pPr>
-              <w:keepNext w:val="0"/>
-              <w:keepLines w:val="0"/>
-              <w:widowControl/>
-              <w:suppressLineNumbers w:val="0"/>
-              <w:jc w:val="left"/>
+            <w:shd w:val="clear" w:color="auto" w:fill="auto"/>
+            <w:vAlign w:val="center"/>
+          </w:tcPr>
+          <w:p>
+            <w:pPr>
+              <w:keepNext w:val="0"/>
+              <w:keepLines w:val="0"/>
+              <w:widowControl/>
+              <w:suppressLineNumbers w:val="0"/>
+              <w:jc w:val="left"/>
+              <w:rPr>
+                <w:rFonts w:hint="default" w:ascii="Times New Roman" w:hAnsi="Times New Roman" w:cs="Times New Roman"/>
+                <w:sz w:val="20"/>
+                <w:szCs w:val="20"/>
+              </w:rPr>
+            </w:pPr>
+          </w:p>
+        </w:tc>
+        <w:tc>
+          <w:tcPr>
+            <w:tcW w:w="0" w:type="auto"/>
+            <w:shd w:val="clear" w:color="auto" w:fill="auto"/>
+            <w:vAlign w:val="center"/>
+          </w:tcPr>
+          <w:p>
+            <w:pPr>
+              <w:keepNext w:val="0"/>
+              <w:keepLines w:val="0"/>
+              <w:widowControl/>
+              <w:suppressLineNumbers w:val="0"/>
+              <w:jc w:val="left"/>
+              <w:rPr>
+                <w:rFonts w:hint="default" w:ascii="Times New Roman" w:hAnsi="Times New Roman" w:cs="Times New Roman"/>
+                <w:sz w:val="20"/>
+                <w:szCs w:val="20"/>
+              </w:rPr>
             </w:pPr>
             <w:r>
               <w:rPr>
                 <w:rStyle w:val="7"/>
-                <w:rFonts w:ascii="SimSun" w:hAnsi="SimSun" w:eastAsia="SimSun" w:cs="SimSun"/>
-                <w:kern w:val="0"/>
-                <w:sz w:val="24"/>
-                <w:szCs w:val="24"/>
+                <w:rFonts w:hint="default" w:ascii="Times New Roman" w:hAnsi="Times New Roman" w:eastAsia="SimSun" w:cs="Times New Roman"/>
+                <w:kern w:val="0"/>
+                <w:sz w:val="20"/>
+                <w:szCs w:val="20"/>
                 <w:lang w:val="en-US" w:eastAsia="zh-CN" w:bidi="ar"/>
               </w:rPr>
               <w:t>Tổng điểm Sprint</w:t>
             </w:r>
-          </w:p>
-        </w:tc>
-        <w:tc>
-          <w:tcPr>
-            <w:tcW w:w="0" w:type="auto"/>
-            <w:shd w:val="clear"/>
-            <w:vAlign w:val="center"/>
-          </w:tcPr>
-          <w:p>
-            <w:pPr>
-              <w:keepNext w:val="0"/>
-              <w:keepLines w:val="0"/>
-              <w:widowControl/>
-              <w:suppressLineNumbers w:val="0"/>
-              <w:jc w:val="left"/>
+            <w:bookmarkStart w:id="0" w:name="_GoBack"/>
+            <w:bookmarkEnd w:id="0"/>
+          </w:p>
+        </w:tc>
+        <w:tc>
+          <w:tcPr>
+            <w:tcW w:w="0" w:type="auto"/>
+            <w:shd w:val="clear" w:color="auto" w:fill="auto"/>
+            <w:vAlign w:val="center"/>
+          </w:tcPr>
+          <w:p>
+            <w:pPr>
+              <w:keepNext w:val="0"/>
+              <w:keepLines w:val="0"/>
+              <w:widowControl/>
+              <w:suppressLineNumbers w:val="0"/>
+              <w:jc w:val="left"/>
+              <w:rPr>
+                <w:rFonts w:hint="default" w:ascii="Times New Roman" w:hAnsi="Times New Roman" w:cs="Times New Roman"/>
+                <w:sz w:val="20"/>
+                <w:szCs w:val="20"/>
+              </w:rPr>
             </w:pPr>
             <w:r>
               <w:rPr>
                 <w:rStyle w:val="7"/>
-                <w:rFonts w:ascii="SimSun" w:hAnsi="SimSun" w:eastAsia="SimSun" w:cs="SimSun"/>
-                <w:kern w:val="0"/>
-                <w:sz w:val="24"/>
-                <w:szCs w:val="24"/>
+                <w:rFonts w:hint="default" w:ascii="Times New Roman" w:hAnsi="Times New Roman" w:eastAsia="SimSun" w:cs="Times New Roman"/>
+                <w:kern w:val="0"/>
+                <w:sz w:val="20"/>
+                <w:szCs w:val="20"/>
                 <w:lang w:val="en-US" w:eastAsia="zh-CN" w:bidi="ar"/>
               </w:rPr>
               <w:t>9/10</w:t>
@@ -2377,16 +2835,21 @@
         <w:tc>
           <w:tcPr>
             <w:tcW w:w="0" w:type="auto"/>
-            <w:shd w:val="clear"/>
-            <w:vAlign w:val="center"/>
-          </w:tcPr>
-          <w:p>
-            <w:pPr>
-              <w:keepNext w:val="0"/>
-              <w:keepLines w:val="0"/>
-              <w:widowControl/>
-              <w:suppressLineNumbers w:val="0"/>
-              <w:jc w:val="left"/>
+            <w:shd w:val="clear" w:color="auto" w:fill="auto"/>
+            <w:vAlign w:val="center"/>
+          </w:tcPr>
+          <w:p>
+            <w:pPr>
+              <w:keepNext w:val="0"/>
+              <w:keepLines w:val="0"/>
+              <w:widowControl/>
+              <w:suppressLineNumbers w:val="0"/>
+              <w:jc w:val="left"/>
+              <w:rPr>
+                <w:rFonts w:hint="default" w:ascii="Times New Roman" w:hAnsi="Times New Roman" w:cs="Times New Roman"/>
+                <w:sz w:val="20"/>
+                <w:szCs w:val="20"/>
+              </w:rPr>
             </w:pPr>
           </w:p>
         </w:tc>
@@ -2399,12 +2862,20 @@
         <w:keepLines w:val="0"/>
         <w:widowControl/>
         <w:suppressLineNumbers w:val="0"/>
+        <w:rPr>
+          <w:rFonts w:hint="default" w:ascii="Times New Roman" w:hAnsi="Times New Roman" w:cs="Times New Roman"/>
+          <w:sz w:val="20"/>
+          <w:szCs w:val="20"/>
+        </w:rPr>
       </w:pPr>
       <w:r>
+        <w:rPr>
+          <w:rFonts w:hint="default" w:ascii="Times New Roman" w:hAnsi="Times New Roman" w:cs="Times New Roman"/>
+          <w:sz w:val="20"/>
+          <w:szCs w:val="20"/>
+        </w:rPr>
         <w:t>Nhóm sử dụng 9/10 điểm, còn 1 điểm dự phòng. Hai hạng mục Could là hẹn giờ đặt xe trước và chat với tài xế chưa được đưa vào Sprint. Chúng có thể được xem xét ở Sprint sau.</w:t>
       </w:r>
-      <w:bookmarkStart w:id="0" w:name="_GoBack"/>
-      <w:bookmarkEnd w:id="0"/>
     </w:p>
     <w:p>
       <w:pPr>
@@ -2413,8 +2884,18 @@
         <w:keepLines w:val="0"/>
         <w:widowControl/>
         <w:suppressLineNumbers w:val="0"/>
+        <w:rPr>
+          <w:rFonts w:hint="default" w:ascii="Times New Roman" w:hAnsi="Times New Roman" w:cs="Times New Roman"/>
+          <w:sz w:val="20"/>
+          <w:szCs w:val="20"/>
+        </w:rPr>
       </w:pPr>
       <w:r>
+        <w:rPr>
+          <w:rFonts w:hint="default" w:ascii="Times New Roman" w:hAnsi="Times New Roman" w:cs="Times New Roman"/>
+          <w:sz w:val="20"/>
+          <w:szCs w:val="20"/>
+        </w:rPr>
         <w:t>3.4. Tính tỷ lệ Must</w:t>
       </w:r>
     </w:p>
@@ -2425,8 +2906,18 @@
         <w:keepLines w:val="0"/>
         <w:widowControl/>
         <w:suppressLineNumbers w:val="0"/>
+        <w:rPr>
+          <w:rFonts w:hint="default" w:ascii="Times New Roman" w:hAnsi="Times New Roman" w:cs="Times New Roman"/>
+          <w:sz w:val="20"/>
+          <w:szCs w:val="20"/>
+        </w:rPr>
       </w:pPr>
       <w:r>
+        <w:rPr>
+          <w:rFonts w:hint="default" w:ascii="Times New Roman" w:hAnsi="Times New Roman" w:cs="Times New Roman"/>
+          <w:sz w:val="20"/>
+          <w:szCs w:val="20"/>
+        </w:rPr>
         <w:t>Tổng điểm các hạng mục Must:</w:t>
       </w:r>
     </w:p>
@@ -2437,8 +2928,18 @@
         <w:keepLines w:val="0"/>
         <w:widowControl/>
         <w:suppressLineNumbers w:val="0"/>
+        <w:rPr>
+          <w:rFonts w:hint="default" w:ascii="Times New Roman" w:hAnsi="Times New Roman" w:cs="Times New Roman"/>
+          <w:sz w:val="20"/>
+          <w:szCs w:val="20"/>
+        </w:rPr>
       </w:pPr>
       <w:r>
+        <w:rPr>
+          <w:rFonts w:hint="default" w:ascii="Times New Roman" w:hAnsi="Times New Roman" w:cs="Times New Roman"/>
+          <w:sz w:val="20"/>
+          <w:szCs w:val="20"/>
+        </w:rPr>
         <w:t>2 + 2 = 4 điểm.</w:t>
       </w:r>
     </w:p>
@@ -2449,8 +2950,18 @@
         <w:keepLines w:val="0"/>
         <w:widowControl/>
         <w:suppressLineNumbers w:val="0"/>
+        <w:rPr>
+          <w:rFonts w:hint="default" w:ascii="Times New Roman" w:hAnsi="Times New Roman" w:cs="Times New Roman"/>
+          <w:sz w:val="20"/>
+          <w:szCs w:val="20"/>
+        </w:rPr>
       </w:pPr>
       <w:r>
+        <w:rPr>
+          <w:rFonts w:hint="default" w:ascii="Times New Roman" w:hAnsi="Times New Roman" w:cs="Times New Roman"/>
+          <w:sz w:val="20"/>
+          <w:szCs w:val="20"/>
+        </w:rPr>
         <w:t>Tỷ lệ Must so với năng lực Sprint:</w:t>
       </w:r>
     </w:p>
@@ -2461,17 +2972,35 @@
         <w:keepLines w:val="0"/>
         <w:widowControl/>
         <w:suppressLineNumbers w:val="0"/>
+        <w:rPr>
+          <w:rFonts w:hint="default" w:ascii="Times New Roman" w:hAnsi="Times New Roman" w:cs="Times New Roman"/>
+          <w:sz w:val="20"/>
+          <w:szCs w:val="20"/>
+        </w:rPr>
       </w:pPr>
       <w:r>
+        <w:rPr>
+          <w:rFonts w:hint="default" w:ascii="Times New Roman" w:hAnsi="Times New Roman" w:cs="Times New Roman"/>
+          <w:sz w:val="20"/>
+          <w:szCs w:val="20"/>
+        </w:rPr>
         <w:t xml:space="preserve">Tỷ lệ Must = (4 / 10) × 100% = </w:t>
       </w:r>
       <w:r>
         <w:rPr>
           <w:rStyle w:val="7"/>
+          <w:rFonts w:hint="default" w:ascii="Times New Roman" w:hAnsi="Times New Roman" w:cs="Times New Roman"/>
+          <w:sz w:val="20"/>
+          <w:szCs w:val="20"/>
         </w:rPr>
         <w:t>40%</w:t>
       </w:r>
       <w:r>
+        <w:rPr>
+          <w:rFonts w:hint="default" w:ascii="Times New Roman" w:hAnsi="Times New Roman" w:cs="Times New Roman"/>
+          <w:sz w:val="20"/>
+          <w:szCs w:val="20"/>
+        </w:rPr>
         <w:t>.</w:t>
       </w:r>
     </w:p>
@@ -2482,12 +3011,30 @@
         <w:keepLines w:val="0"/>
         <w:widowControl/>
         <w:suppressLineNumbers w:val="0"/>
+        <w:rPr>
+          <w:rFonts w:hint="default" w:ascii="Times New Roman" w:hAnsi="Times New Roman" w:cs="Times New Roman"/>
+          <w:sz w:val="20"/>
+          <w:szCs w:val="20"/>
+        </w:rPr>
       </w:pPr>
       <w:r>
+        <w:rPr>
+          <w:rFonts w:hint="default" w:ascii="Times New Roman" w:hAnsi="Times New Roman" w:cs="Times New Roman"/>
+          <w:sz w:val="20"/>
+          <w:szCs w:val="20"/>
+        </w:rPr>
         <w:t>Tỷ lệ Must hiện tại là 40%, thấp hơn mức khoảng 60% theo yêu cầu. Tuy nhiên, không nên tự động nâng nhãn các hạng mục không bắt buộc chỉ để đạt tỷ lệ này. Nếu muốn tiến gần mức 60%, nhóm cần đánh giá lại yêu cầu của bản phát hành và trao đổi với Product Owner trước khi chốt phạm vi Sprint.</w:t>
       </w:r>
     </w:p>
-    <w:p/>
+    <w:p>
+      <w:pPr>
+        <w:rPr>
+          <w:rFonts w:hint="default" w:ascii="Times New Roman" w:hAnsi="Times New Roman" w:cs="Times New Roman"/>
+          <w:sz w:val="20"/>
+          <w:szCs w:val="20"/>
+        </w:rPr>
+      </w:pPr>
+    </w:p>
     <w:sectPr>
       <w:pgSz w:w="11906" w:h="16838"/>
       <w:pgMar w:top="1440" w:right="1800" w:bottom="1440" w:left="1800" w:header="720" w:footer="720" w:gutter="0"/>
@@ -2592,7 +3139,7 @@
     <w:lsdException w:unhideWhenUsed="0" w:uiPriority="0" w:semiHidden="0" w:name="Document Map"/>
     <w:lsdException w:unhideWhenUsed="0" w:uiPriority="0" w:semiHidden="0" w:name="Plain Text"/>
     <w:lsdException w:unhideWhenUsed="0" w:uiPriority="0" w:semiHidden="0" w:name="E-mail Signature"/>
-    <w:lsdException w:unhideWhenUsed="0" w:uiPriority="0" w:semiHidden="0" w:name="Normal (Web)"/>
+    <w:lsdException w:qFormat="1" w:unhideWhenUsed="0" w:uiPriority="0" w:semiHidden="0" w:name="Normal (Web)"/>
     <w:lsdException w:unhideWhenUsed="0" w:uiPriority="0" w:semiHidden="0" w:name="HTML Acronym"/>
     <w:lsdException w:unhideWhenUsed="0" w:uiPriority="0" w:semiHidden="0" w:name="HTML Address"/>
     <w:lsdException w:unhideWhenUsed="0" w:uiPriority="0" w:semiHidden="0" w:name="HTML Cite"/>
@@ -2755,6 +3302,7 @@
   </w:style>
   <w:style w:type="paragraph" w:styleId="8">
     <w:name w:val="Normal (Web)"/>
+    <w:qFormat/>
     <w:uiPriority w:val="0"/>
     <w:pPr>
       <w:spacing w:before="0" w:beforeAutospacing="1" w:after="0" w:afterAutospacing="1"/>
@@ -2762,6 +3310,7 @@
       <w:jc w:val="left"/>
     </w:pPr>
     <w:rPr>
+      <w:rFonts w:ascii="Times New Roman" w:hAnsi="Times New Roman" w:eastAsia="SimSun" w:cs="Times New Roman"/>
       <w:kern w:val="0"/>
       <w:sz w:val="24"/>
       <w:szCs w:val="24"/>

</xml_diff>